<commit_message>
docs: Sprint 3 features in the specs, README, CLAUDE.md and progress log
</commit_message>
<xml_diff>
--- a/thesis/doc/DacTaThietKe_API_HeThongThiVictory_TranHoangLong.docx
+++ b/thesis/doc/DacTaThietKe_API_HeThongThiVictory_TranHoangLong.docx
@@ -1101,6 +1101,36 @@
     </w:p>
     <w:p>
       <w:pPr>
+        <w:pStyle w:val="ListBullet"/>
+        <w:jc w:val="both"/>
+      </w:pPr>
+      <w:r>
+        <w:rPr>
+          <w:b/>
+        </w:rPr>
+        <w:t xml:space="preserve">Safe Exam Browser: </w:t>
+      </w:r>
+      <w:r>
+        <w:t>kỳ thi có Config Key thì mọi yêu cầu của thí sinh phải mang header X-SafeExamBrowser-ConfigKeyHash = SHA-256(URL tuyệt đối + Config Key); sai hoặc thiếu trả 403 "Open this test in Safe Exam Browser."</w:t>
+      </w:r>
+    </w:p>
+    <w:p>
+      <w:pPr>
+        <w:pStyle w:val="ListBullet"/>
+        <w:jc w:val="both"/>
+      </w:pPr>
+      <w:r>
+        <w:rPr>
+          <w:b/>
+        </w:rPr>
+        <w:t xml:space="preserve">Đồng hồ máy thí sinh: </w:t>
+      </w:r>
+      <w:r>
+        <w:t>heartbeat gửi kèm X-Client-Time (mili giây Unix); lệch quá 2 phút tạo cảnh báo ClockSkew.</w:t>
+      </w:r>
+    </w:p>
+    <w:p>
+      <w:pPr>
         <w:keepNext/>
         <w:jc w:val="center"/>
       </w:pPr>
@@ -3887,6 +3917,436 @@
           </w:p>
         </w:tc>
       </w:tr>
+      <w:tr>
+        <w:tc>
+          <w:tcPr>
+            <w:tcW w:type="dxa" w:w="1247"/>
+          </w:tcPr>
+          <w:p>
+            <w:pPr>
+              <w:spacing w:line="276" w:lineRule="auto" w:after="40"/>
+            </w:pPr>
+            <w:r>
+              <w:rPr>
+                <w:sz w:val="24"/>
+              </w:rPr>
+            </w:r>
+            <w:r>
+              <w:rPr>
+                <w:sz w:val="24"/>
+              </w:rPr>
+              <w:t>PUT</w:t>
+            </w:r>
+          </w:p>
+        </w:tc>
+        <w:tc>
+          <w:tcPr>
+            <w:tcW w:type="dxa" w:w="3175"/>
+          </w:tcPr>
+          <w:p>
+            <w:pPr>
+              <w:spacing w:line="276" w:lineRule="auto" w:after="40"/>
+            </w:pPr>
+            <w:r>
+              <w:rPr>
+                <w:sz w:val="24"/>
+              </w:rPr>
+            </w:r>
+            <w:r>
+              <w:rPr>
+                <w:sz w:val="24"/>
+              </w:rPr>
+              <w:t>/api/admin/papers/{id}</w:t>
+            </w:r>
+          </w:p>
+        </w:tc>
+        <w:tc>
+          <w:tcPr>
+            <w:tcW w:type="dxa" w:w="1814"/>
+          </w:tcPr>
+          <w:p>
+            <w:pPr>
+              <w:spacing w:line="276" w:lineRule="auto" w:after="40"/>
+            </w:pPr>
+            <w:r>
+              <w:rPr>
+                <w:sz w:val="24"/>
+              </w:rPr>
+            </w:r>
+            <w:r>
+              <w:rPr>
+                <w:sz w:val="24"/>
+              </w:rPr>
+              <w:t>Mảng đề thi</w:t>
+            </w:r>
+          </w:p>
+        </w:tc>
+        <w:tc>
+          <w:tcPr>
+            <w:tcW w:type="dxa" w:w="2835"/>
+          </w:tcPr>
+          <w:p>
+            <w:pPr>
+              <w:spacing w:line="276" w:lineRule="auto" w:after="40"/>
+            </w:pPr>
+            <w:r>
+              <w:rPr>
+                <w:sz w:val="24"/>
+              </w:rPr>
+            </w:r>
+            <w:r>
+              <w:rPr>
+                <w:sz w:val="24"/>
+              </w:rPr>
+              <w:t>Sửa tiêu đề đề nháp (409 khi đã xuất bản).</w:t>
+            </w:r>
+          </w:p>
+        </w:tc>
+      </w:tr>
+      <w:tr>
+        <w:tc>
+          <w:tcPr>
+            <w:tcW w:type="dxa" w:w="1247"/>
+          </w:tcPr>
+          <w:p>
+            <w:pPr>
+              <w:spacing w:line="276" w:lineRule="auto" w:after="40"/>
+            </w:pPr>
+            <w:r>
+              <w:rPr>
+                <w:sz w:val="24"/>
+              </w:rPr>
+            </w:r>
+            <w:r>
+              <w:rPr>
+                <w:sz w:val="24"/>
+              </w:rPr>
+              <w:t>PUT</w:t>
+            </w:r>
+          </w:p>
+        </w:tc>
+        <w:tc>
+          <w:tcPr>
+            <w:tcW w:type="dxa" w:w="3175"/>
+          </w:tcPr>
+          <w:p>
+            <w:pPr>
+              <w:spacing w:line="276" w:lineRule="auto" w:after="40"/>
+            </w:pPr>
+            <w:r>
+              <w:rPr>
+                <w:sz w:val="24"/>
+              </w:rPr>
+            </w:r>
+            <w:r>
+              <w:rPr>
+                <w:sz w:val="24"/>
+              </w:rPr>
+              <w:t>/api/admin/papers/{id}/parts/{partNo}</w:t>
+            </w:r>
+          </w:p>
+        </w:tc>
+        <w:tc>
+          <w:tcPr>
+            <w:tcW w:type="dxa" w:w="1814"/>
+          </w:tcPr>
+          <w:p>
+            <w:pPr>
+              <w:spacing w:line="276" w:lineRule="auto" w:after="40"/>
+            </w:pPr>
+            <w:r>
+              <w:rPr>
+                <w:sz w:val="24"/>
+              </w:rPr>
+            </w:r>
+            <w:r>
+              <w:rPr>
+                <w:sz w:val="24"/>
+              </w:rPr>
+              <w:t>Mảng đề thi</w:t>
+            </w:r>
+          </w:p>
+        </w:tc>
+        <w:tc>
+          <w:tcPr>
+            <w:tcW w:type="dxa" w:w="2835"/>
+          </w:tcPr>
+          <w:p>
+            <w:pPr>
+              <w:spacing w:line="276" w:lineRule="auto" w:after="40"/>
+            </w:pPr>
+            <w:r>
+              <w:rPr>
+                <w:sz w:val="24"/>
+              </w:rPr>
+            </w:r>
+            <w:r>
+              <w:rPr>
+                <w:sz w:val="24"/>
+              </w:rPr>
+              <w:t>Sửa tiêu đề và đoạn văn của một part.</w:t>
+            </w:r>
+          </w:p>
+        </w:tc>
+      </w:tr>
+      <w:tr>
+        <w:tc>
+          <w:tcPr>
+            <w:tcW w:type="dxa" w:w="1247"/>
+          </w:tcPr>
+          <w:p>
+            <w:pPr>
+              <w:spacing w:line="276" w:lineRule="auto" w:after="40"/>
+            </w:pPr>
+            <w:r>
+              <w:rPr>
+                <w:sz w:val="24"/>
+              </w:rPr>
+            </w:r>
+            <w:r>
+              <w:rPr>
+                <w:sz w:val="24"/>
+              </w:rPr>
+              <w:t>PUT</w:t>
+            </w:r>
+          </w:p>
+        </w:tc>
+        <w:tc>
+          <w:tcPr>
+            <w:tcW w:type="dxa" w:w="3175"/>
+          </w:tcPr>
+          <w:p>
+            <w:pPr>
+              <w:spacing w:line="276" w:lineRule="auto" w:after="40"/>
+            </w:pPr>
+            <w:r>
+              <w:rPr>
+                <w:sz w:val="24"/>
+              </w:rPr>
+            </w:r>
+            <w:r>
+              <w:rPr>
+                <w:sz w:val="24"/>
+              </w:rPr>
+              <w:t>/api/admin/papers/{id}/parts/{partNo}/groups/{orderNo}</w:t>
+            </w:r>
+          </w:p>
+        </w:tc>
+        <w:tc>
+          <w:tcPr>
+            <w:tcW w:type="dxa" w:w="1814"/>
+          </w:tcPr>
+          <w:p>
+            <w:pPr>
+              <w:spacing w:line="276" w:lineRule="auto" w:after="40"/>
+            </w:pPr>
+            <w:r>
+              <w:rPr>
+                <w:sz w:val="24"/>
+              </w:rPr>
+            </w:r>
+            <w:r>
+              <w:rPr>
+                <w:sz w:val="24"/>
+              </w:rPr>
+              <w:t>Mảng đề thi</w:t>
+            </w:r>
+          </w:p>
+        </w:tc>
+        <w:tc>
+          <w:tcPr>
+            <w:tcW w:type="dxa" w:w="2835"/>
+          </w:tcPr>
+          <w:p>
+            <w:pPr>
+              <w:spacing w:line="276" w:lineRule="auto" w:after="40"/>
+            </w:pPr>
+            <w:r>
+              <w:rPr>
+                <w:sz w:val="24"/>
+              </w:rPr>
+            </w:r>
+            <w:r>
+              <w:rPr>
+                <w:sz w:val="24"/>
+              </w:rPr>
+              <w:t>Sửa hướng dẫn, đoạn văn có ô trống {{q:n}}, chữ trên thẻ.</w:t>
+            </w:r>
+          </w:p>
+        </w:tc>
+      </w:tr>
+      <w:tr>
+        <w:tc>
+          <w:tcPr>
+            <w:tcW w:type="dxa" w:w="1247"/>
+          </w:tcPr>
+          <w:p>
+            <w:pPr>
+              <w:spacing w:line="276" w:lineRule="auto" w:after="40"/>
+            </w:pPr>
+            <w:r>
+              <w:rPr>
+                <w:sz w:val="24"/>
+              </w:rPr>
+            </w:r>
+            <w:r>
+              <w:rPr>
+                <w:sz w:val="24"/>
+              </w:rPr>
+              <w:t>PUT</w:t>
+            </w:r>
+          </w:p>
+        </w:tc>
+        <w:tc>
+          <w:tcPr>
+            <w:tcW w:type="dxa" w:w="3175"/>
+          </w:tcPr>
+          <w:p>
+            <w:pPr>
+              <w:spacing w:line="276" w:lineRule="auto" w:after="40"/>
+            </w:pPr>
+            <w:r>
+              <w:rPr>
+                <w:sz w:val="24"/>
+              </w:rPr>
+            </w:r>
+            <w:r>
+              <w:rPr>
+                <w:sz w:val="24"/>
+              </w:rPr>
+              <w:t>/api/admin/papers/{id}/questions/{number}</w:t>
+            </w:r>
+          </w:p>
+        </w:tc>
+        <w:tc>
+          <w:tcPr>
+            <w:tcW w:type="dxa" w:w="1814"/>
+          </w:tcPr>
+          <w:p>
+            <w:pPr>
+              <w:spacing w:line="276" w:lineRule="auto" w:after="40"/>
+            </w:pPr>
+            <w:r>
+              <w:rPr>
+                <w:sz w:val="24"/>
+              </w:rPr>
+            </w:r>
+            <w:r>
+              <w:rPr>
+                <w:sz w:val="24"/>
+              </w:rPr>
+              <w:t>Mảng đề thi</w:t>
+            </w:r>
+          </w:p>
+        </w:tc>
+        <w:tc>
+          <w:tcPr>
+            <w:tcW w:type="dxa" w:w="2835"/>
+          </w:tcPr>
+          <w:p>
+            <w:pPr>
+              <w:spacing w:line="276" w:lineRule="auto" w:after="40"/>
+            </w:pPr>
+            <w:r>
+              <w:rPr>
+                <w:sz w:val="24"/>
+              </w:rPr>
+            </w:r>
+            <w:r>
+              <w:rPr>
+                <w:sz w:val="24"/>
+              </w:rPr>
+              <w:t>Sửa câu hỏi, chữ của lựa chọn, đáp án, điểm, số từ tối thiểu.</w:t>
+            </w:r>
+          </w:p>
+        </w:tc>
+      </w:tr>
+      <w:tr>
+        <w:tc>
+          <w:tcPr>
+            <w:tcW w:type="dxa" w:w="1247"/>
+          </w:tcPr>
+          <w:p>
+            <w:pPr>
+              <w:spacing w:line="276" w:lineRule="auto" w:after="40"/>
+            </w:pPr>
+            <w:r>
+              <w:rPr>
+                <w:sz w:val="24"/>
+              </w:rPr>
+            </w:r>
+            <w:r>
+              <w:rPr>
+                <w:sz w:val="24"/>
+              </w:rPr>
+              <w:t>POST</w:t>
+            </w:r>
+          </w:p>
+        </w:tc>
+        <w:tc>
+          <w:tcPr>
+            <w:tcW w:type="dxa" w:w="3175"/>
+          </w:tcPr>
+          <w:p>
+            <w:pPr>
+              <w:spacing w:line="276" w:lineRule="auto" w:after="40"/>
+            </w:pPr>
+            <w:r>
+              <w:rPr>
+                <w:sz w:val="24"/>
+              </w:rPr>
+            </w:r>
+            <w:r>
+              <w:rPr>
+                <w:sz w:val="24"/>
+              </w:rPr>
+              <w:t>/api/admin/papers/{id}/parts/{partNo}/audio</w:t>
+            </w:r>
+          </w:p>
+        </w:tc>
+        <w:tc>
+          <w:tcPr>
+            <w:tcW w:type="dxa" w:w="1814"/>
+          </w:tcPr>
+          <w:p>
+            <w:pPr>
+              <w:spacing w:line="276" w:lineRule="auto" w:after="40"/>
+            </w:pPr>
+            <w:r>
+              <w:rPr>
+                <w:sz w:val="24"/>
+              </w:rPr>
+            </w:r>
+            <w:r>
+              <w:rPr>
+                <w:sz w:val="24"/>
+              </w:rPr>
+              <w:t>Mảng đề thi</w:t>
+            </w:r>
+          </w:p>
+        </w:tc>
+        <w:tc>
+          <w:tcPr>
+            <w:tcW w:type="dxa" w:w="2835"/>
+          </w:tcPr>
+          <w:p>
+            <w:pPr>
+              <w:spacing w:line="276" w:lineRule="auto" w:after="40"/>
+            </w:pPr>
+            <w:r>
+              <w:rPr>
+                <w:sz w:val="24"/>
+              </w:rPr>
+            </w:r>
+            <w:r>
+              <w:rPr>
+                <w:sz w:val="24"/>
+              </w:rPr>
+              <w:t>Thay file nghe của part (mp3, m4a, ogg, wav; tối đa 60 MB).</w:t>
+            </w:r>
+          </w:p>
+        </w:tc>
+      </w:tr>
     </w:tbl>
     <w:p/>
     <w:p>
@@ -3899,7 +4359,7 @@
           <w:b/>
           <w:sz w:val="24"/>
         </w:rPr>
-        <w:t>Bảng 7. Kỳ thi (mảng kỳ thi)</w:t>
+        <w:t>Bảng 7. Trung tâm</w:t>
       </w:r>
     </w:p>
     <w:tbl>
@@ -4052,7 +4512,7 @@
               <w:rPr>
                 <w:sz w:val="24"/>
               </w:rPr>
-              <w:t>/api/admin/exam-types</w:t>
+              <w:t>/api/site</w:t>
             </w:r>
           </w:p>
         </w:tc>
@@ -4073,7 +4533,7 @@
               <w:rPr>
                 <w:sz w:val="24"/>
               </w:rPr>
-              <w:t>Mảng kỳ thi</w:t>
+              <w:t>Không</w:t>
             </w:r>
           </w:p>
         </w:tc>
@@ -4094,7 +4554,7 @@
               <w:rPr>
                 <w:sz w:val="24"/>
               </w:rPr>
-              <w:t>Loại bài thi và các phần thi mẫu.</w:t>
+              <w:t>Tên và logo trung tâm (màn hình đăng nhập dùng trước khi có tài khoản).</w:t>
             </w:r>
           </w:p>
         </w:tc>
@@ -4138,7 +4598,7 @@
               <w:rPr>
                 <w:sz w:val="24"/>
               </w:rPr>
-              <w:t>/api/admin/exam-papers</w:t>
+              <w:t>/api/site/logo</w:t>
             </w:r>
           </w:p>
         </w:tc>
@@ -4159,7 +4619,7 @@
               <w:rPr>
                 <w:sz w:val="24"/>
               </w:rPr>
-              <w:t>Mảng kỳ thi</w:t>
+              <w:t>Không</w:t>
             </w:r>
           </w:p>
         </w:tc>
@@ -4180,7 +4640,7 @@
               <w:rPr>
                 <w:sz w:val="24"/>
               </w:rPr>
-              <w:t>Các đề đã xuất bản để chọn cho kỳ thi.</w:t>
+              <w:t>Tệp logo hiện tại.</w:t>
             </w:r>
           </w:p>
         </w:tc>
@@ -4203,7 +4663,7 @@
               <w:rPr>
                 <w:sz w:val="24"/>
               </w:rPr>
-              <w:t>GET</w:t>
+              <w:t>PUT</w:t>
             </w:r>
           </w:p>
         </w:tc>
@@ -4224,7 +4684,7 @@
               <w:rPr>
                 <w:sz w:val="24"/>
               </w:rPr>
-              <w:t>/api/admin/assignable-staff</w:t>
+              <w:t>/api/admin/site</w:t>
             </w:r>
           </w:p>
         </w:tc>
@@ -4245,7 +4705,7 @@
               <w:rPr>
                 <w:sz w:val="24"/>
               </w:rPr>
-              <w:t>Mảng kỳ thi</w:t>
+              <w:t>Mảng trung tâm</w:t>
             </w:r>
           </w:p>
         </w:tc>
@@ -4266,7 +4726,7 @@
               <w:rPr>
                 <w:sz w:val="24"/>
               </w:rPr>
-              <w:t>Tài khoản giám thị và giám khảo để phân công.</w:t>
+              <w:t>Đổi tên trung tâm.</w:t>
             </w:r>
           </w:p>
         </w:tc>
@@ -4310,7 +4770,7 @@
               <w:rPr>
                 <w:sz w:val="24"/>
               </w:rPr>
-              <w:t>/api/admin/exams</w:t>
+              <w:t>/api/admin/site/logo</w:t>
             </w:r>
           </w:p>
         </w:tc>
@@ -4331,7 +4791,7 @@
               <w:rPr>
                 <w:sz w:val="24"/>
               </w:rPr>
-              <w:t>Mảng kỳ thi</w:t>
+              <w:t>Mảng trung tâm</w:t>
             </w:r>
           </w:p>
         </w:tc>
@@ -4352,437 +4812,7 @@
               <w:rPr>
                 <w:sz w:val="24"/>
               </w:rPr>
-              <w:t>Tạo kỳ thi; sinh mã PIN và mật khẩu giám thị nếu để trống.</w:t>
-            </w:r>
-          </w:p>
-        </w:tc>
-      </w:tr>
-      <w:tr>
-        <w:tc>
-          <w:tcPr>
-            <w:tcW w:type="dxa" w:w="1247"/>
-          </w:tcPr>
-          <w:p>
-            <w:pPr>
-              <w:spacing w:line="276" w:lineRule="auto" w:after="40"/>
-            </w:pPr>
-            <w:r>
-              <w:rPr>
-                <w:sz w:val="24"/>
-              </w:rPr>
-            </w:r>
-            <w:r>
-              <w:rPr>
-                <w:sz w:val="24"/>
-              </w:rPr>
-              <w:t>PUT</w:t>
-            </w:r>
-          </w:p>
-        </w:tc>
-        <w:tc>
-          <w:tcPr>
-            <w:tcW w:type="dxa" w:w="3175"/>
-          </w:tcPr>
-          <w:p>
-            <w:pPr>
-              <w:spacing w:line="276" w:lineRule="auto" w:after="40"/>
-            </w:pPr>
-            <w:r>
-              <w:rPr>
-                <w:sz w:val="24"/>
-              </w:rPr>
-            </w:r>
-            <w:r>
-              <w:rPr>
-                <w:sz w:val="24"/>
-              </w:rPr>
-              <w:t>/api/admin/exams/{id}</w:t>
-            </w:r>
-          </w:p>
-        </w:tc>
-        <w:tc>
-          <w:tcPr>
-            <w:tcW w:type="dxa" w:w="1814"/>
-          </w:tcPr>
-          <w:p>
-            <w:pPr>
-              <w:spacing w:line="276" w:lineRule="auto" w:after="40"/>
-            </w:pPr>
-            <w:r>
-              <w:rPr>
-                <w:sz w:val="24"/>
-              </w:rPr>
-            </w:r>
-            <w:r>
-              <w:rPr>
-                <w:sz w:val="24"/>
-              </w:rPr>
-              <w:t>Mảng kỳ thi</w:t>
-            </w:r>
-          </w:p>
-        </w:tc>
-        <w:tc>
-          <w:tcPr>
-            <w:tcW w:type="dxa" w:w="2835"/>
-          </w:tcPr>
-          <w:p>
-            <w:pPr>
-              <w:spacing w:line="276" w:lineRule="auto" w:after="40"/>
-            </w:pPr>
-            <w:r>
-              <w:rPr>
-                <w:sz w:val="24"/>
-              </w:rPr>
-            </w:r>
-            <w:r>
-              <w:rPr>
-                <w:sz w:val="24"/>
-              </w:rPr>
-              <w:t>Sửa kỳ thi; không đổi đề khi đã có thí sinh làm bài.</w:t>
-            </w:r>
-          </w:p>
-        </w:tc>
-      </w:tr>
-      <w:tr>
-        <w:tc>
-          <w:tcPr>
-            <w:tcW w:type="dxa" w:w="1247"/>
-          </w:tcPr>
-          <w:p>
-            <w:pPr>
-              <w:spacing w:line="276" w:lineRule="auto" w:after="40"/>
-            </w:pPr>
-            <w:r>
-              <w:rPr>
-                <w:sz w:val="24"/>
-              </w:rPr>
-            </w:r>
-            <w:r>
-              <w:rPr>
-                <w:sz w:val="24"/>
-              </w:rPr>
-              <w:t>POST</w:t>
-            </w:r>
-          </w:p>
-        </w:tc>
-        <w:tc>
-          <w:tcPr>
-            <w:tcW w:type="dxa" w:w="3175"/>
-          </w:tcPr>
-          <w:p>
-            <w:pPr>
-              <w:spacing w:line="276" w:lineRule="auto" w:after="40"/>
-            </w:pPr>
-            <w:r>
-              <w:rPr>
-                <w:sz w:val="24"/>
-              </w:rPr>
-            </w:r>
-            <w:r>
-              <w:rPr>
-                <w:sz w:val="24"/>
-              </w:rPr>
-              <w:t>/api/admin/exams/{id}/status</w:t>
-            </w:r>
-          </w:p>
-        </w:tc>
-        <w:tc>
-          <w:tcPr>
-            <w:tcW w:type="dxa" w:w="1814"/>
-          </w:tcPr>
-          <w:p>
-            <w:pPr>
-              <w:spacing w:line="276" w:lineRule="auto" w:after="40"/>
-            </w:pPr>
-            <w:r>
-              <w:rPr>
-                <w:sz w:val="24"/>
-              </w:rPr>
-            </w:r>
-            <w:r>
-              <w:rPr>
-                <w:sz w:val="24"/>
-              </w:rPr>
-              <w:t>Mảng kỳ thi</w:t>
-            </w:r>
-          </w:p>
-        </w:tc>
-        <w:tc>
-          <w:tcPr>
-            <w:tcW w:type="dxa" w:w="2835"/>
-          </w:tcPr>
-          <w:p>
-            <w:pPr>
-              <w:spacing w:line="276" w:lineRule="auto" w:after="40"/>
-            </w:pPr>
-            <w:r>
-              <w:rPr>
-                <w:sz w:val="24"/>
-              </w:rPr>
-            </w:r>
-            <w:r>
-              <w:rPr>
-                <w:sz w:val="24"/>
-              </w:rPr>
-              <w:t>Đổi trạng thái Draft / Scheduled / Active / Closed.</w:t>
-            </w:r>
-          </w:p>
-        </w:tc>
-      </w:tr>
-      <w:tr>
-        <w:tc>
-          <w:tcPr>
-            <w:tcW w:type="dxa" w:w="1247"/>
-          </w:tcPr>
-          <w:p>
-            <w:pPr>
-              <w:spacing w:line="276" w:lineRule="auto" w:after="40"/>
-            </w:pPr>
-            <w:r>
-              <w:rPr>
-                <w:sz w:val="24"/>
-              </w:rPr>
-            </w:r>
-            <w:r>
-              <w:rPr>
-                <w:sz w:val="24"/>
-              </w:rPr>
-              <w:t>DELETE</w:t>
-            </w:r>
-          </w:p>
-        </w:tc>
-        <w:tc>
-          <w:tcPr>
-            <w:tcW w:type="dxa" w:w="3175"/>
-          </w:tcPr>
-          <w:p>
-            <w:pPr>
-              <w:spacing w:line="276" w:lineRule="auto" w:after="40"/>
-            </w:pPr>
-            <w:r>
-              <w:rPr>
-                <w:sz w:val="24"/>
-              </w:rPr>
-            </w:r>
-            <w:r>
-              <w:rPr>
-                <w:sz w:val="24"/>
-              </w:rPr>
-              <w:t>/api/admin/exams/{id}</w:t>
-            </w:r>
-          </w:p>
-        </w:tc>
-        <w:tc>
-          <w:tcPr>
-            <w:tcW w:type="dxa" w:w="1814"/>
-          </w:tcPr>
-          <w:p>
-            <w:pPr>
-              <w:spacing w:line="276" w:lineRule="auto" w:after="40"/>
-            </w:pPr>
-            <w:r>
-              <w:rPr>
-                <w:sz w:val="24"/>
-              </w:rPr>
-            </w:r>
-            <w:r>
-              <w:rPr>
-                <w:sz w:val="24"/>
-              </w:rPr>
-              <w:t>Mảng kỳ thi</w:t>
-            </w:r>
-          </w:p>
-        </w:tc>
-        <w:tc>
-          <w:tcPr>
-            <w:tcW w:type="dxa" w:w="2835"/>
-          </w:tcPr>
-          <w:p>
-            <w:pPr>
-              <w:spacing w:line="276" w:lineRule="auto" w:after="40"/>
-            </w:pPr>
-            <w:r>
-              <w:rPr>
-                <w:sz w:val="24"/>
-              </w:rPr>
-            </w:r>
-            <w:r>
-              <w:rPr>
-                <w:sz w:val="24"/>
-              </w:rPr>
-              <w:t>Gửi yêu cầu xoá (202); 409 khi đã có thí sinh làm bài.</w:t>
-            </w:r>
-          </w:p>
-        </w:tc>
-      </w:tr>
-      <w:tr>
-        <w:tc>
-          <w:tcPr>
-            <w:tcW w:type="dxa" w:w="1247"/>
-          </w:tcPr>
-          <w:p>
-            <w:pPr>
-              <w:spacing w:line="276" w:lineRule="auto" w:after="40"/>
-            </w:pPr>
-            <w:r>
-              <w:rPr>
-                <w:sz w:val="24"/>
-              </w:rPr>
-            </w:r>
-            <w:r>
-              <w:rPr>
-                <w:sz w:val="24"/>
-              </w:rPr>
-              <w:t>PUT</w:t>
-            </w:r>
-          </w:p>
-        </w:tc>
-        <w:tc>
-          <w:tcPr>
-            <w:tcW w:type="dxa" w:w="3175"/>
-          </w:tcPr>
-          <w:p>
-            <w:pPr>
-              <w:spacing w:line="276" w:lineRule="auto" w:after="40"/>
-            </w:pPr>
-            <w:r>
-              <w:rPr>
-                <w:sz w:val="24"/>
-              </w:rPr>
-            </w:r>
-            <w:r>
-              <w:rPr>
-                <w:sz w:val="24"/>
-              </w:rPr>
-              <w:t>/api/admin/exams/{id}/invigilators</w:t>
-            </w:r>
-          </w:p>
-        </w:tc>
-        <w:tc>
-          <w:tcPr>
-            <w:tcW w:type="dxa" w:w="1814"/>
-          </w:tcPr>
-          <w:p>
-            <w:pPr>
-              <w:spacing w:line="276" w:lineRule="auto" w:after="40"/>
-            </w:pPr>
-            <w:r>
-              <w:rPr>
-                <w:sz w:val="24"/>
-              </w:rPr>
-            </w:r>
-            <w:r>
-              <w:rPr>
-                <w:sz w:val="24"/>
-              </w:rPr>
-              <w:t>Mảng kỳ thi</w:t>
-            </w:r>
-          </w:p>
-        </w:tc>
-        <w:tc>
-          <w:tcPr>
-            <w:tcW w:type="dxa" w:w="2835"/>
-          </w:tcPr>
-          <w:p>
-            <w:pPr>
-              <w:spacing w:line="276" w:lineRule="auto" w:after="40"/>
-            </w:pPr>
-            <w:r>
-              <w:rPr>
-                <w:sz w:val="24"/>
-              </w:rPr>
-            </w:r>
-            <w:r>
-              <w:rPr>
-                <w:sz w:val="24"/>
-              </w:rPr>
-              <w:t>Phân công giám thị.</w:t>
-            </w:r>
-          </w:p>
-        </w:tc>
-      </w:tr>
-      <w:tr>
-        <w:tc>
-          <w:tcPr>
-            <w:tcW w:type="dxa" w:w="1247"/>
-          </w:tcPr>
-          <w:p>
-            <w:pPr>
-              <w:spacing w:line="276" w:lineRule="auto" w:after="40"/>
-            </w:pPr>
-            <w:r>
-              <w:rPr>
-                <w:sz w:val="24"/>
-              </w:rPr>
-            </w:r>
-            <w:r>
-              <w:rPr>
-                <w:sz w:val="24"/>
-              </w:rPr>
-              <w:t>PUT</w:t>
-            </w:r>
-          </w:p>
-        </w:tc>
-        <w:tc>
-          <w:tcPr>
-            <w:tcW w:type="dxa" w:w="3175"/>
-          </w:tcPr>
-          <w:p>
-            <w:pPr>
-              <w:spacing w:line="276" w:lineRule="auto" w:after="40"/>
-            </w:pPr>
-            <w:r>
-              <w:rPr>
-                <w:sz w:val="24"/>
-              </w:rPr>
-            </w:r>
-            <w:r>
-              <w:rPr>
-                <w:sz w:val="24"/>
-              </w:rPr>
-              <w:t>/api/admin/exams/{id}/examiners</w:t>
-            </w:r>
-          </w:p>
-        </w:tc>
-        <w:tc>
-          <w:tcPr>
-            <w:tcW w:type="dxa" w:w="1814"/>
-          </w:tcPr>
-          <w:p>
-            <w:pPr>
-              <w:spacing w:line="276" w:lineRule="auto" w:after="40"/>
-            </w:pPr>
-            <w:r>
-              <w:rPr>
-                <w:sz w:val="24"/>
-              </w:rPr>
-            </w:r>
-            <w:r>
-              <w:rPr>
-                <w:sz w:val="24"/>
-              </w:rPr>
-              <w:t>Mảng kỳ thi</w:t>
-            </w:r>
-          </w:p>
-        </w:tc>
-        <w:tc>
-          <w:tcPr>
-            <w:tcW w:type="dxa" w:w="2835"/>
-          </w:tcPr>
-          <w:p>
-            <w:pPr>
-              <w:spacing w:line="276" w:lineRule="auto" w:after="40"/>
-            </w:pPr>
-            <w:r>
-              <w:rPr>
-                <w:sz w:val="24"/>
-              </w:rPr>
-            </w:r>
-            <w:r>
-              <w:rPr>
-                <w:sz w:val="24"/>
-              </w:rPr>
-              <w:t>Phân công giám khảo.</w:t>
+              <w:t>Tải logo PNG (tối đa 1 MB; SVG bị từ chối).</w:t>
             </w:r>
           </w:p>
         </w:tc>
@@ -4799,7 +4829,7 @@
           <w:b/>
           <w:sz w:val="24"/>
         </w:rPr>
-        <w:t>Bảng 8. Thí sinh (mảng thí sinh)</w:t>
+        <w:t>Bảng 8. Kỳ thi (mảng kỳ thi)</w:t>
       </w:r>
     </w:p>
     <w:tbl>
@@ -4952,7 +4982,7 @@
               <w:rPr>
                 <w:sz w:val="24"/>
               </w:rPr>
-              <w:t>/api/admin/exams/{id}/candidates</w:t>
+              <w:t>/api/admin/exam-types</w:t>
             </w:r>
           </w:p>
         </w:tc>
@@ -4973,7 +5003,7 @@
               <w:rPr>
                 <w:sz w:val="24"/>
               </w:rPr>
-              <w:t>Mảng kỳ thi hoặc thí sinh</w:t>
+              <w:t>Mảng kỳ thi</w:t>
             </w:r>
           </w:p>
         </w:tc>
@@ -4994,7 +5024,7 @@
               <w:rPr>
                 <w:sz w:val="24"/>
               </w:rPr>
-              <w:t>Danh sách thí sinh của kỳ thi.</w:t>
+              <w:t>Loại bài thi và các phần thi mẫu.</w:t>
             </w:r>
           </w:p>
         </w:tc>
@@ -5017,7 +5047,7 @@
               <w:rPr>
                 <w:sz w:val="24"/>
               </w:rPr>
-              <w:t>POST</w:t>
+              <w:t>GET</w:t>
             </w:r>
           </w:p>
         </w:tc>
@@ -5038,7 +5068,7 @@
               <w:rPr>
                 <w:sz w:val="24"/>
               </w:rPr>
-              <w:t>/api/admin/exams/{id}/candidates</w:t>
+              <w:t>/api/admin/exam-papers</w:t>
             </w:r>
           </w:p>
         </w:tc>
@@ -5059,7 +5089,7 @@
               <w:rPr>
                 <w:sz w:val="24"/>
               </w:rPr>
-              <w:t>Mảng thí sinh</w:t>
+              <w:t>Mảng kỳ thi</w:t>
             </w:r>
           </w:p>
         </w:tc>
@@ -5080,7 +5110,7 @@
               <w:rPr>
                 <w:sz w:val="24"/>
               </w:rPr>
-              <w:t>Thêm thí sinh (dán từ Excel); cấp tên đăng nhập và mật khẩu.</w:t>
+              <w:t>Các đề đã xuất bản để chọn cho kỳ thi.</w:t>
             </w:r>
           </w:p>
         </w:tc>
@@ -5103,7 +5133,7 @@
               <w:rPr>
                 <w:sz w:val="24"/>
               </w:rPr>
-              <w:t>PUT</w:t>
+              <w:t>GET</w:t>
             </w:r>
           </w:p>
         </w:tc>
@@ -5124,7 +5154,7 @@
               <w:rPr>
                 <w:sz w:val="24"/>
               </w:rPr>
-              <w:t>/api/admin/candidates/{id}</w:t>
+              <w:t>/api/admin/assignable-staff</w:t>
             </w:r>
           </w:p>
         </w:tc>
@@ -5145,7 +5175,7 @@
               <w:rPr>
                 <w:sz w:val="24"/>
               </w:rPr>
-              <w:t>Mảng thí sinh</w:t>
+              <w:t>Mảng kỳ thi</w:t>
             </w:r>
           </w:p>
         </w:tc>
@@ -5166,7 +5196,7 @@
               <w:rPr>
                 <w:sz w:val="24"/>
               </w:rPr>
-              <w:t>Sửa thông tin thí sinh.</w:t>
+              <w:t>Tài khoản giám thị và giám khảo để phân công.</w:t>
             </w:r>
           </w:p>
         </w:tc>
@@ -5210,7 +5240,7 @@
               <w:rPr>
                 <w:sz w:val="24"/>
               </w:rPr>
-              <w:t>/api/admin/candidates/{id}/reset-password</w:t>
+              <w:t>/api/admin/exams</w:t>
             </w:r>
           </w:p>
         </w:tc>
@@ -5231,7 +5261,7 @@
               <w:rPr>
                 <w:sz w:val="24"/>
               </w:rPr>
-              <w:t>Mảng thí sinh</w:t>
+              <w:t>Mảng kỳ thi</w:t>
             </w:r>
           </w:p>
         </w:tc>
@@ -5252,7 +5282,7 @@
               <w:rPr>
                 <w:sz w:val="24"/>
               </w:rPr>
-              <w:t>Cấp mật khẩu mới, đăng xuất máy đang dùng.</w:t>
+              <w:t>Tạo kỳ thi; sinh mã PIN và mật khẩu giám thị nếu để trống.</w:t>
             </w:r>
           </w:p>
         </w:tc>
@@ -5275,6 +5305,178 @@
               <w:rPr>
                 <w:sz w:val="24"/>
               </w:rPr>
+              <w:t>PUT</w:t>
+            </w:r>
+          </w:p>
+        </w:tc>
+        <w:tc>
+          <w:tcPr>
+            <w:tcW w:type="dxa" w:w="3175"/>
+          </w:tcPr>
+          <w:p>
+            <w:pPr>
+              <w:spacing w:line="276" w:lineRule="auto" w:after="40"/>
+            </w:pPr>
+            <w:r>
+              <w:rPr>
+                <w:sz w:val="24"/>
+              </w:rPr>
+            </w:r>
+            <w:r>
+              <w:rPr>
+                <w:sz w:val="24"/>
+              </w:rPr>
+              <w:t>/api/admin/exams/{id}</w:t>
+            </w:r>
+          </w:p>
+        </w:tc>
+        <w:tc>
+          <w:tcPr>
+            <w:tcW w:type="dxa" w:w="1814"/>
+          </w:tcPr>
+          <w:p>
+            <w:pPr>
+              <w:spacing w:line="276" w:lineRule="auto" w:after="40"/>
+            </w:pPr>
+            <w:r>
+              <w:rPr>
+                <w:sz w:val="24"/>
+              </w:rPr>
+            </w:r>
+            <w:r>
+              <w:rPr>
+                <w:sz w:val="24"/>
+              </w:rPr>
+              <w:t>Mảng kỳ thi</w:t>
+            </w:r>
+          </w:p>
+        </w:tc>
+        <w:tc>
+          <w:tcPr>
+            <w:tcW w:type="dxa" w:w="2835"/>
+          </w:tcPr>
+          <w:p>
+            <w:pPr>
+              <w:spacing w:line="276" w:lineRule="auto" w:after="40"/>
+            </w:pPr>
+            <w:r>
+              <w:rPr>
+                <w:sz w:val="24"/>
+              </w:rPr>
+            </w:r>
+            <w:r>
+              <w:rPr>
+                <w:sz w:val="24"/>
+              </w:rPr>
+              <w:t>Sửa kỳ thi; không đổi đề khi đã có thí sinh làm bài.</w:t>
+            </w:r>
+          </w:p>
+        </w:tc>
+      </w:tr>
+      <w:tr>
+        <w:tc>
+          <w:tcPr>
+            <w:tcW w:type="dxa" w:w="1247"/>
+          </w:tcPr>
+          <w:p>
+            <w:pPr>
+              <w:spacing w:line="276" w:lineRule="auto" w:after="40"/>
+            </w:pPr>
+            <w:r>
+              <w:rPr>
+                <w:sz w:val="24"/>
+              </w:rPr>
+            </w:r>
+            <w:r>
+              <w:rPr>
+                <w:sz w:val="24"/>
+              </w:rPr>
+              <w:t>POST</w:t>
+            </w:r>
+          </w:p>
+        </w:tc>
+        <w:tc>
+          <w:tcPr>
+            <w:tcW w:type="dxa" w:w="3175"/>
+          </w:tcPr>
+          <w:p>
+            <w:pPr>
+              <w:spacing w:line="276" w:lineRule="auto" w:after="40"/>
+            </w:pPr>
+            <w:r>
+              <w:rPr>
+                <w:sz w:val="24"/>
+              </w:rPr>
+            </w:r>
+            <w:r>
+              <w:rPr>
+                <w:sz w:val="24"/>
+              </w:rPr>
+              <w:t>/api/admin/exams/{id}/status</w:t>
+            </w:r>
+          </w:p>
+        </w:tc>
+        <w:tc>
+          <w:tcPr>
+            <w:tcW w:type="dxa" w:w="1814"/>
+          </w:tcPr>
+          <w:p>
+            <w:pPr>
+              <w:spacing w:line="276" w:lineRule="auto" w:after="40"/>
+            </w:pPr>
+            <w:r>
+              <w:rPr>
+                <w:sz w:val="24"/>
+              </w:rPr>
+            </w:r>
+            <w:r>
+              <w:rPr>
+                <w:sz w:val="24"/>
+              </w:rPr>
+              <w:t>Mảng kỳ thi</w:t>
+            </w:r>
+          </w:p>
+        </w:tc>
+        <w:tc>
+          <w:tcPr>
+            <w:tcW w:type="dxa" w:w="2835"/>
+          </w:tcPr>
+          <w:p>
+            <w:pPr>
+              <w:spacing w:line="276" w:lineRule="auto" w:after="40"/>
+            </w:pPr>
+            <w:r>
+              <w:rPr>
+                <w:sz w:val="24"/>
+              </w:rPr>
+            </w:r>
+            <w:r>
+              <w:rPr>
+                <w:sz w:val="24"/>
+              </w:rPr>
+              <w:t>Đổi trạng thái Draft / Scheduled / Active / Closed.</w:t>
+            </w:r>
+          </w:p>
+        </w:tc>
+      </w:tr>
+      <w:tr>
+        <w:tc>
+          <w:tcPr>
+            <w:tcW w:type="dxa" w:w="1247"/>
+          </w:tcPr>
+          <w:p>
+            <w:pPr>
+              <w:spacing w:line="276" w:lineRule="auto" w:after="40"/>
+            </w:pPr>
+            <w:r>
+              <w:rPr>
+                <w:sz w:val="24"/>
+              </w:rPr>
+            </w:r>
+            <w:r>
+              <w:rPr>
+                <w:sz w:val="24"/>
+              </w:rPr>
               <w:t>DELETE</w:t>
             </w:r>
           </w:p>
@@ -5296,7 +5498,7 @@
               <w:rPr>
                 <w:sz w:val="24"/>
               </w:rPr>
-              <w:t>/api/admin/candidates/{id}</w:t>
+              <w:t>/api/admin/exams/{id}</w:t>
             </w:r>
           </w:p>
         </w:tc>
@@ -5317,7 +5519,7 @@
               <w:rPr>
                 <w:sz w:val="24"/>
               </w:rPr>
-              <w:t>Mảng thí sinh</w:t>
+              <w:t>Mảng kỳ thi</w:t>
             </w:r>
           </w:p>
         </w:tc>
@@ -5338,7 +5540,179 @@
               <w:rPr>
                 <w:sz w:val="24"/>
               </w:rPr>
-              <w:t>Gửi yêu cầu xoá (202); 409 khi thí sinh đã làm bài.</w:t>
+              <w:t>Gửi yêu cầu xoá (202); 409 khi đã có thí sinh làm bài.</w:t>
+            </w:r>
+          </w:p>
+        </w:tc>
+      </w:tr>
+      <w:tr>
+        <w:tc>
+          <w:tcPr>
+            <w:tcW w:type="dxa" w:w="1247"/>
+          </w:tcPr>
+          <w:p>
+            <w:pPr>
+              <w:spacing w:line="276" w:lineRule="auto" w:after="40"/>
+            </w:pPr>
+            <w:r>
+              <w:rPr>
+                <w:sz w:val="24"/>
+              </w:rPr>
+            </w:r>
+            <w:r>
+              <w:rPr>
+                <w:sz w:val="24"/>
+              </w:rPr>
+              <w:t>PUT</w:t>
+            </w:r>
+          </w:p>
+        </w:tc>
+        <w:tc>
+          <w:tcPr>
+            <w:tcW w:type="dxa" w:w="3175"/>
+          </w:tcPr>
+          <w:p>
+            <w:pPr>
+              <w:spacing w:line="276" w:lineRule="auto" w:after="40"/>
+            </w:pPr>
+            <w:r>
+              <w:rPr>
+                <w:sz w:val="24"/>
+              </w:rPr>
+            </w:r>
+            <w:r>
+              <w:rPr>
+                <w:sz w:val="24"/>
+              </w:rPr>
+              <w:t>/api/admin/exams/{id}/invigilators</w:t>
+            </w:r>
+          </w:p>
+        </w:tc>
+        <w:tc>
+          <w:tcPr>
+            <w:tcW w:type="dxa" w:w="1814"/>
+          </w:tcPr>
+          <w:p>
+            <w:pPr>
+              <w:spacing w:line="276" w:lineRule="auto" w:after="40"/>
+            </w:pPr>
+            <w:r>
+              <w:rPr>
+                <w:sz w:val="24"/>
+              </w:rPr>
+            </w:r>
+            <w:r>
+              <w:rPr>
+                <w:sz w:val="24"/>
+              </w:rPr>
+              <w:t>Mảng kỳ thi</w:t>
+            </w:r>
+          </w:p>
+        </w:tc>
+        <w:tc>
+          <w:tcPr>
+            <w:tcW w:type="dxa" w:w="2835"/>
+          </w:tcPr>
+          <w:p>
+            <w:pPr>
+              <w:spacing w:line="276" w:lineRule="auto" w:after="40"/>
+            </w:pPr>
+            <w:r>
+              <w:rPr>
+                <w:sz w:val="24"/>
+              </w:rPr>
+            </w:r>
+            <w:r>
+              <w:rPr>
+                <w:sz w:val="24"/>
+              </w:rPr>
+              <w:t>Phân công giám thị.</w:t>
+            </w:r>
+          </w:p>
+        </w:tc>
+      </w:tr>
+      <w:tr>
+        <w:tc>
+          <w:tcPr>
+            <w:tcW w:type="dxa" w:w="1247"/>
+          </w:tcPr>
+          <w:p>
+            <w:pPr>
+              <w:spacing w:line="276" w:lineRule="auto" w:after="40"/>
+            </w:pPr>
+            <w:r>
+              <w:rPr>
+                <w:sz w:val="24"/>
+              </w:rPr>
+            </w:r>
+            <w:r>
+              <w:rPr>
+                <w:sz w:val="24"/>
+              </w:rPr>
+              <w:t>PUT</w:t>
+            </w:r>
+          </w:p>
+        </w:tc>
+        <w:tc>
+          <w:tcPr>
+            <w:tcW w:type="dxa" w:w="3175"/>
+          </w:tcPr>
+          <w:p>
+            <w:pPr>
+              <w:spacing w:line="276" w:lineRule="auto" w:after="40"/>
+            </w:pPr>
+            <w:r>
+              <w:rPr>
+                <w:sz w:val="24"/>
+              </w:rPr>
+            </w:r>
+            <w:r>
+              <w:rPr>
+                <w:sz w:val="24"/>
+              </w:rPr>
+              <w:t>/api/admin/exams/{id}/examiners</w:t>
+            </w:r>
+          </w:p>
+        </w:tc>
+        <w:tc>
+          <w:tcPr>
+            <w:tcW w:type="dxa" w:w="1814"/>
+          </w:tcPr>
+          <w:p>
+            <w:pPr>
+              <w:spacing w:line="276" w:lineRule="auto" w:after="40"/>
+            </w:pPr>
+            <w:r>
+              <w:rPr>
+                <w:sz w:val="24"/>
+              </w:rPr>
+            </w:r>
+            <w:r>
+              <w:rPr>
+                <w:sz w:val="24"/>
+              </w:rPr>
+              <w:t>Mảng kỳ thi</w:t>
+            </w:r>
+          </w:p>
+        </w:tc>
+        <w:tc>
+          <w:tcPr>
+            <w:tcW w:type="dxa" w:w="2835"/>
+          </w:tcPr>
+          <w:p>
+            <w:pPr>
+              <w:spacing w:line="276" w:lineRule="auto" w:after="40"/>
+            </w:pPr>
+            <w:r>
+              <w:rPr>
+                <w:sz w:val="24"/>
+              </w:rPr>
+            </w:r>
+            <w:r>
+              <w:rPr>
+                <w:sz w:val="24"/>
+              </w:rPr>
+              <w:t>Phân công giám khảo.</w:t>
             </w:r>
           </w:p>
         </w:tc>
@@ -5355,7 +5729,7 @@
           <w:b/>
           <w:sz w:val="24"/>
         </w:rPr>
-        <w:t>Bảng 9. Phòng thi (nhân viên)</w:t>
+        <w:t>Bảng 9. Thí sinh (mảng thí sinh)</w:t>
       </w:r>
     </w:p>
     <w:tbl>
@@ -5508,7 +5882,7 @@
               <w:rPr>
                 <w:sz w:val="24"/>
               </w:rPr>
-              <w:t>/api/staff/exams</w:t>
+              <w:t>/api/admin/exams/{id}/candidates</w:t>
             </w:r>
           </w:p>
         </w:tc>
@@ -5529,7 +5903,7 @@
               <w:rPr>
                 <w:sz w:val="24"/>
               </w:rPr>
-              <w:t>Nhân viên</w:t>
+              <w:t>Mảng kỳ thi hoặc thí sinh</w:t>
             </w:r>
           </w:p>
         </w:tc>
@@ -5550,7 +5924,7 @@
               <w:rPr>
                 <w:sz w:val="24"/>
               </w:rPr>
-              <w:t>Kỳ thi người dùng được thấy (giám thị, giám khảo: kỳ được phân công).</w:t>
+              <w:t>Danh sách thí sinh của kỳ thi.</w:t>
             </w:r>
           </w:p>
         </w:tc>
@@ -5573,7 +5947,7 @@
               <w:rPr>
                 <w:sz w:val="24"/>
               </w:rPr>
-              <w:t>GET</w:t>
+              <w:t>POST</w:t>
             </w:r>
           </w:p>
         </w:tc>
@@ -5594,7 +5968,7 @@
               <w:rPr>
                 <w:sz w:val="24"/>
               </w:rPr>
-              <w:t>/api/staff/exams/{id}</w:t>
+              <w:t>/api/admin/exams/{id}/candidates</w:t>
             </w:r>
           </w:p>
         </w:tc>
@@ -5615,7 +5989,7 @@
               <w:rPr>
                 <w:sz w:val="24"/>
               </w:rPr>
-              <w:t>Nhân viên</w:t>
+              <w:t>Mảng thí sinh</w:t>
             </w:r>
           </w:p>
         </w:tc>
@@ -5636,7 +6010,7 @@
               <w:rPr>
                 <w:sz w:val="24"/>
               </w:rPr>
-              <w:t>Chi tiết kỳ thi; giám khảo không nhận mã PIN và mật khẩu giám thị.</w:t>
+              <w:t>Thêm thí sinh (dán từ Excel); cấp tên đăng nhập và mật khẩu.</w:t>
             </w:r>
           </w:p>
         </w:tc>
@@ -5659,7 +6033,7 @@
               <w:rPr>
                 <w:sz w:val="24"/>
               </w:rPr>
-              <w:t>GET</w:t>
+              <w:t>PUT</w:t>
             </w:r>
           </w:p>
         </w:tc>
@@ -5680,7 +6054,7 @@
               <w:rPr>
                 <w:sz w:val="24"/>
               </w:rPr>
-              <w:t>/api/staff/exams/{id}/login-slips</w:t>
+              <w:t>/api/admin/candidates/{id}</w:t>
             </w:r>
           </w:p>
         </w:tc>
@@ -5701,7 +6075,7 @@
               <w:rPr>
                 <w:sz w:val="24"/>
               </w:rPr>
-              <w:t>Người tổ chức, giám thị</w:t>
+              <w:t>Mảng thí sinh</w:t>
             </w:r>
           </w:p>
         </w:tc>
@@ -5722,7 +6096,7 @@
               <w:rPr>
                 <w:sz w:val="24"/>
               </w:rPr>
-              <w:t>Phiếu đăng nhập kèm mật khẩu thí sinh.</w:t>
+              <w:t>Sửa thông tin thí sinh.</w:t>
             </w:r>
           </w:p>
         </w:tc>
@@ -5745,7 +6119,7 @@
               <w:rPr>
                 <w:sz w:val="24"/>
               </w:rPr>
-              <w:t>GET</w:t>
+              <w:t>POST</w:t>
             </w:r>
           </w:p>
         </w:tc>
@@ -5766,7 +6140,7 @@
               <w:rPr>
                 <w:sz w:val="24"/>
               </w:rPr>
-              <w:t>/api/staff/exams/{id}/sections/{sid}/monitor</w:t>
+              <w:t>/api/admin/candidates/{id}/reset-password</w:t>
             </w:r>
           </w:p>
         </w:tc>
@@ -5787,7 +6161,7 @@
               <w:rPr>
                 <w:sz w:val="24"/>
               </w:rPr>
-              <w:t>Mảng kỳ thi, giám thị</w:t>
+              <w:t>Mảng thí sinh</w:t>
             </w:r>
           </w:p>
         </w:tc>
@@ -5808,7 +6182,7 @@
               <w:rPr>
                 <w:sz w:val="24"/>
               </w:rPr>
-              <w:t>Bảng theo dõi phần thi.</w:t>
+              <w:t>Cấp mật khẩu mới, đăng xuất máy đang dùng.</w:t>
             </w:r>
           </w:p>
         </w:tc>
@@ -5831,7 +6205,7 @@
               <w:rPr>
                 <w:sz w:val="24"/>
               </w:rPr>
-              <w:t>POST</w:t>
+              <w:t>DELETE</w:t>
             </w:r>
           </w:p>
         </w:tc>
@@ -5852,7 +6226,7 @@
               <w:rPr>
                 <w:sz w:val="24"/>
               </w:rPr>
-              <w:t>/api/staff/exams/{id}/sections/{sid}/actions</w:t>
+              <w:t>/api/admin/candidates/{id}</w:t>
             </w:r>
           </w:p>
         </w:tc>
@@ -5873,7 +6247,7 @@
               <w:rPr>
                 <w:sz w:val="24"/>
               </w:rPr>
-              <w:t>Mảng kỳ thi, giám thị</w:t>
+              <w:t>Mảng thí sinh</w:t>
             </w:r>
           </w:p>
         </w:tc>
@@ -5894,179 +6268,7 @@
               <w:rPr>
                 <w:sz w:val="24"/>
               </w:rPr>
-              <w:t>Pause, Resume, AddIncidentTime, EndNow, EndAt, EndIn, UseTestEndTime, RewindAudio; trả số thí sinh áp dụng và bị bỏ qua kèm lý do.</w:t>
-            </w:r>
-          </w:p>
-        </w:tc>
-      </w:tr>
-      <w:tr>
-        <w:tc>
-          <w:tcPr>
-            <w:tcW w:type="dxa" w:w="1247"/>
-          </w:tcPr>
-          <w:p>
-            <w:pPr>
-              <w:spacing w:line="276" w:lineRule="auto" w:after="40"/>
-            </w:pPr>
-            <w:r>
-              <w:rPr>
-                <w:sz w:val="24"/>
-              </w:rPr>
-            </w:r>
-            <w:r>
-              <w:rPr>
-                <w:sz w:val="24"/>
-              </w:rPr>
-              <w:t>GET</w:t>
-            </w:r>
-          </w:p>
-        </w:tc>
-        <w:tc>
-          <w:tcPr>
-            <w:tcW w:type="dxa" w:w="3175"/>
-          </w:tcPr>
-          <w:p>
-            <w:pPr>
-              <w:spacing w:line="276" w:lineRule="auto" w:after="40"/>
-            </w:pPr>
-            <w:r>
-              <w:rPr>
-                <w:sz w:val="24"/>
-              </w:rPr>
-            </w:r>
-            <w:r>
-              <w:rPr>
-                <w:sz w:val="24"/>
-              </w:rPr>
-              <w:t>/api/staff/exams/{id}/messages</w:t>
-            </w:r>
-          </w:p>
-        </w:tc>
-        <w:tc>
-          <w:tcPr>
-            <w:tcW w:type="dxa" w:w="1814"/>
-          </w:tcPr>
-          <w:p>
-            <w:pPr>
-              <w:spacing w:line="276" w:lineRule="auto" w:after="40"/>
-            </w:pPr>
-            <w:r>
-              <w:rPr>
-                <w:sz w:val="24"/>
-              </w:rPr>
-            </w:r>
-            <w:r>
-              <w:rPr>
-                <w:sz w:val="24"/>
-              </w:rPr>
-              <w:t>Mảng kỳ thi, giám thị</w:t>
-            </w:r>
-          </w:p>
-        </w:tc>
-        <w:tc>
-          <w:tcPr>
-            <w:tcW w:type="dxa" w:w="2835"/>
-          </w:tcPr>
-          <w:p>
-            <w:pPr>
-              <w:spacing w:line="276" w:lineRule="auto" w:after="40"/>
-            </w:pPr>
-            <w:r>
-              <w:rPr>
-                <w:sz w:val="24"/>
-              </w:rPr>
-            </w:r>
-            <w:r>
-              <w:rPr>
-                <w:sz w:val="24"/>
-              </w:rPr>
-              <w:t>Các thông báo đã gửi.</w:t>
-            </w:r>
-          </w:p>
-        </w:tc>
-      </w:tr>
-      <w:tr>
-        <w:tc>
-          <w:tcPr>
-            <w:tcW w:type="dxa" w:w="1247"/>
-          </w:tcPr>
-          <w:p>
-            <w:pPr>
-              <w:spacing w:line="276" w:lineRule="auto" w:after="40"/>
-            </w:pPr>
-            <w:r>
-              <w:rPr>
-                <w:sz w:val="24"/>
-              </w:rPr>
-            </w:r>
-            <w:r>
-              <w:rPr>
-                <w:sz w:val="24"/>
-              </w:rPr>
-              <w:t>POST</w:t>
-            </w:r>
-          </w:p>
-        </w:tc>
-        <w:tc>
-          <w:tcPr>
-            <w:tcW w:type="dxa" w:w="3175"/>
-          </w:tcPr>
-          <w:p>
-            <w:pPr>
-              <w:spacing w:line="276" w:lineRule="auto" w:after="40"/>
-            </w:pPr>
-            <w:r>
-              <w:rPr>
-                <w:sz w:val="24"/>
-              </w:rPr>
-            </w:r>
-            <w:r>
-              <w:rPr>
-                <w:sz w:val="24"/>
-              </w:rPr>
-              <w:t>/api/staff/exams/{id}/messages</w:t>
-            </w:r>
-          </w:p>
-        </w:tc>
-        <w:tc>
-          <w:tcPr>
-            <w:tcW w:type="dxa" w:w="1814"/>
-          </w:tcPr>
-          <w:p>
-            <w:pPr>
-              <w:spacing w:line="276" w:lineRule="auto" w:after="40"/>
-            </w:pPr>
-            <w:r>
-              <w:rPr>
-                <w:sz w:val="24"/>
-              </w:rPr>
-            </w:r>
-            <w:r>
-              <w:rPr>
-                <w:sz w:val="24"/>
-              </w:rPr>
-              <w:t>Mảng kỳ thi, giám thị</w:t>
-            </w:r>
-          </w:p>
-        </w:tc>
-        <w:tc>
-          <w:tcPr>
-            <w:tcW w:type="dxa" w:w="2835"/>
-          </w:tcPr>
-          <w:p>
-            <w:pPr>
-              <w:spacing w:line="276" w:lineRule="auto" w:after="40"/>
-            </w:pPr>
-            <w:r>
-              <w:rPr>
-                <w:sz w:val="24"/>
-              </w:rPr>
-            </w:r>
-            <w:r>
-              <w:rPr>
-                <w:sz w:val="24"/>
-              </w:rPr>
-              <w:t>Gửi thông báo cho cả phòng hoặc từng thí sinh.</w:t>
+              <w:t>Gửi yêu cầu xoá (202); 409 khi thí sinh đã làm bài.</w:t>
             </w:r>
           </w:p>
         </w:tc>
@@ -6083,7 +6285,7 @@
           <w:b/>
           <w:sz w:val="24"/>
         </w:rPr>
-        <w:t>Bảng 10. Kết quả và chấm điểm</w:t>
+        <w:t>Bảng 10. Phòng thi (nhân viên)</w:t>
       </w:r>
     </w:p>
     <w:tbl>
@@ -6236,7 +6438,7 @@
               <w:rPr>
                 <w:sz w:val="24"/>
               </w:rPr>
-              <w:t>/api/staff/exams/{id}/results</w:t>
+              <w:t>/api/staff/exams</w:t>
             </w:r>
           </w:p>
         </w:tc>
@@ -6257,7 +6459,7 @@
               <w:rPr>
                 <w:sz w:val="24"/>
               </w:rPr>
-              <w:t>Admin, giám khảo</w:t>
+              <w:t>Nhân viên</w:t>
             </w:r>
           </w:p>
         </w:tc>
@@ -6278,7 +6480,7 @@
               <w:rPr>
                 <w:sz w:val="24"/>
               </w:rPr>
-              <w:t>Bảng điểm từng thí sinh, từng phần thi.</w:t>
+              <w:t>Kỳ thi người dùng được thấy (giám thị, giám khảo: kỳ được phân công).</w:t>
             </w:r>
           </w:p>
         </w:tc>
@@ -6322,7 +6524,7 @@
               <w:rPr>
                 <w:sz w:val="24"/>
               </w:rPr>
-              <w:t>/api/staff/attempts/{id}/marking</w:t>
+              <w:t>/api/staff/exams/{id}</w:t>
             </w:r>
           </w:p>
         </w:tc>
@@ -6343,7 +6545,7 @@
               <w:rPr>
                 <w:sz w:val="24"/>
               </w:rPr>
-              <w:t>Giám khảo được phân công</w:t>
+              <w:t>Nhân viên</w:t>
             </w:r>
           </w:p>
         </w:tc>
@@ -6364,7 +6566,7 @@
               <w:rPr>
                 <w:sz w:val="24"/>
               </w:rPr>
-              <w:t>Bài làm từng câu kèm đáp án; 409 khi phần thi chưa nộp.</w:t>
+              <w:t>Chi tiết kỳ thi; giám khảo không nhận mã PIN và mật khẩu giám thị.</w:t>
             </w:r>
           </w:p>
         </w:tc>
@@ -6387,6 +6589,178 @@
               <w:rPr>
                 <w:sz w:val="24"/>
               </w:rPr>
+              <w:t>GET</w:t>
+            </w:r>
+          </w:p>
+        </w:tc>
+        <w:tc>
+          <w:tcPr>
+            <w:tcW w:type="dxa" w:w="3175"/>
+          </w:tcPr>
+          <w:p>
+            <w:pPr>
+              <w:spacing w:line="276" w:lineRule="auto" w:after="40"/>
+            </w:pPr>
+            <w:r>
+              <w:rPr>
+                <w:sz w:val="24"/>
+              </w:rPr>
+            </w:r>
+            <w:r>
+              <w:rPr>
+                <w:sz w:val="24"/>
+              </w:rPr>
+              <w:t>/api/staff/exams/{id}/login-slips</w:t>
+            </w:r>
+          </w:p>
+        </w:tc>
+        <w:tc>
+          <w:tcPr>
+            <w:tcW w:type="dxa" w:w="1814"/>
+          </w:tcPr>
+          <w:p>
+            <w:pPr>
+              <w:spacing w:line="276" w:lineRule="auto" w:after="40"/>
+            </w:pPr>
+            <w:r>
+              <w:rPr>
+                <w:sz w:val="24"/>
+              </w:rPr>
+            </w:r>
+            <w:r>
+              <w:rPr>
+                <w:sz w:val="24"/>
+              </w:rPr>
+              <w:t>Người tổ chức, giám thị</w:t>
+            </w:r>
+          </w:p>
+        </w:tc>
+        <w:tc>
+          <w:tcPr>
+            <w:tcW w:type="dxa" w:w="2835"/>
+          </w:tcPr>
+          <w:p>
+            <w:pPr>
+              <w:spacing w:line="276" w:lineRule="auto" w:after="40"/>
+            </w:pPr>
+            <w:r>
+              <w:rPr>
+                <w:sz w:val="24"/>
+              </w:rPr>
+            </w:r>
+            <w:r>
+              <w:rPr>
+                <w:sz w:val="24"/>
+              </w:rPr>
+              <w:t>Phiếu đăng nhập kèm mật khẩu thí sinh.</w:t>
+            </w:r>
+          </w:p>
+        </w:tc>
+      </w:tr>
+      <w:tr>
+        <w:tc>
+          <w:tcPr>
+            <w:tcW w:type="dxa" w:w="1247"/>
+          </w:tcPr>
+          <w:p>
+            <w:pPr>
+              <w:spacing w:line="276" w:lineRule="auto" w:after="40"/>
+            </w:pPr>
+            <w:r>
+              <w:rPr>
+                <w:sz w:val="24"/>
+              </w:rPr>
+            </w:r>
+            <w:r>
+              <w:rPr>
+                <w:sz w:val="24"/>
+              </w:rPr>
+              <w:t>GET</w:t>
+            </w:r>
+          </w:p>
+        </w:tc>
+        <w:tc>
+          <w:tcPr>
+            <w:tcW w:type="dxa" w:w="3175"/>
+          </w:tcPr>
+          <w:p>
+            <w:pPr>
+              <w:spacing w:line="276" w:lineRule="auto" w:after="40"/>
+            </w:pPr>
+            <w:r>
+              <w:rPr>
+                <w:sz w:val="24"/>
+              </w:rPr>
+            </w:r>
+            <w:r>
+              <w:rPr>
+                <w:sz w:val="24"/>
+              </w:rPr>
+              <w:t>/api/staff/exams/{id}/sections/{sid}/monitor</w:t>
+            </w:r>
+          </w:p>
+        </w:tc>
+        <w:tc>
+          <w:tcPr>
+            <w:tcW w:type="dxa" w:w="1814"/>
+          </w:tcPr>
+          <w:p>
+            <w:pPr>
+              <w:spacing w:line="276" w:lineRule="auto" w:after="40"/>
+            </w:pPr>
+            <w:r>
+              <w:rPr>
+                <w:sz w:val="24"/>
+              </w:rPr>
+            </w:r>
+            <w:r>
+              <w:rPr>
+                <w:sz w:val="24"/>
+              </w:rPr>
+              <w:t>Mảng kỳ thi, giám thị</w:t>
+            </w:r>
+          </w:p>
+        </w:tc>
+        <w:tc>
+          <w:tcPr>
+            <w:tcW w:type="dxa" w:w="2835"/>
+          </w:tcPr>
+          <w:p>
+            <w:pPr>
+              <w:spacing w:line="276" w:lineRule="auto" w:after="40"/>
+            </w:pPr>
+            <w:r>
+              <w:rPr>
+                <w:sz w:val="24"/>
+              </w:rPr>
+            </w:r>
+            <w:r>
+              <w:rPr>
+                <w:sz w:val="24"/>
+              </w:rPr>
+              <w:t>Bảng theo dõi phần thi.</w:t>
+            </w:r>
+          </w:p>
+        </w:tc>
+      </w:tr>
+      <w:tr>
+        <w:tc>
+          <w:tcPr>
+            <w:tcW w:type="dxa" w:w="1247"/>
+          </w:tcPr>
+          <w:p>
+            <w:pPr>
+              <w:spacing w:line="276" w:lineRule="auto" w:after="40"/>
+            </w:pPr>
+            <w:r>
+              <w:rPr>
+                <w:sz w:val="24"/>
+              </w:rPr>
+            </w:r>
+            <w:r>
+              <w:rPr>
+                <w:sz w:val="24"/>
+              </w:rPr>
               <w:t>POST</w:t>
             </w:r>
           </w:p>
@@ -6408,7 +6782,7 @@
               <w:rPr>
                 <w:sz w:val="24"/>
               </w:rPr>
-              <w:t>/api/staff/attempts/{id}/writing-marks</w:t>
+              <w:t>/api/staff/exams/{id}/sections/{sid}/actions</w:t>
             </w:r>
           </w:p>
         </w:tc>
@@ -6429,7 +6803,7 @@
               <w:rPr>
                 <w:sz w:val="24"/>
               </w:rPr>
-              <w:t>Giám khảo được phân công</w:t>
+              <w:t>Mảng kỳ thi, giám thị</w:t>
             </w:r>
           </w:p>
         </w:tc>
@@ -6450,7 +6824,351 @@
               <w:rPr>
                 <w:sz w:val="24"/>
               </w:rPr>
-              <w:t>Chấm một câu Writing; đủ câu thì điểm Hoàn tất.</w:t>
+              <w:t>Pause, Resume, AddIncidentTime, EndNow, EndAt, EndIn, UseTestEndTime, RewindAudio; trả số thí sinh áp dụng và bị bỏ qua kèm lý do.</w:t>
+            </w:r>
+          </w:p>
+        </w:tc>
+      </w:tr>
+      <w:tr>
+        <w:tc>
+          <w:tcPr>
+            <w:tcW w:type="dxa" w:w="1247"/>
+          </w:tcPr>
+          <w:p>
+            <w:pPr>
+              <w:spacing w:line="276" w:lineRule="auto" w:after="40"/>
+            </w:pPr>
+            <w:r>
+              <w:rPr>
+                <w:sz w:val="24"/>
+              </w:rPr>
+            </w:r>
+            <w:r>
+              <w:rPr>
+                <w:sz w:val="24"/>
+              </w:rPr>
+              <w:t>GET</w:t>
+            </w:r>
+          </w:p>
+        </w:tc>
+        <w:tc>
+          <w:tcPr>
+            <w:tcW w:type="dxa" w:w="3175"/>
+          </w:tcPr>
+          <w:p>
+            <w:pPr>
+              <w:spacing w:line="276" w:lineRule="auto" w:after="40"/>
+            </w:pPr>
+            <w:r>
+              <w:rPr>
+                <w:sz w:val="24"/>
+              </w:rPr>
+            </w:r>
+            <w:r>
+              <w:rPr>
+                <w:sz w:val="24"/>
+              </w:rPr>
+              <w:t>/api/staff/exams/{id}/messages</w:t>
+            </w:r>
+          </w:p>
+        </w:tc>
+        <w:tc>
+          <w:tcPr>
+            <w:tcW w:type="dxa" w:w="1814"/>
+          </w:tcPr>
+          <w:p>
+            <w:pPr>
+              <w:spacing w:line="276" w:lineRule="auto" w:after="40"/>
+            </w:pPr>
+            <w:r>
+              <w:rPr>
+                <w:sz w:val="24"/>
+              </w:rPr>
+            </w:r>
+            <w:r>
+              <w:rPr>
+                <w:sz w:val="24"/>
+              </w:rPr>
+              <w:t>Mảng kỳ thi, giám thị</w:t>
+            </w:r>
+          </w:p>
+        </w:tc>
+        <w:tc>
+          <w:tcPr>
+            <w:tcW w:type="dxa" w:w="2835"/>
+          </w:tcPr>
+          <w:p>
+            <w:pPr>
+              <w:spacing w:line="276" w:lineRule="auto" w:after="40"/>
+            </w:pPr>
+            <w:r>
+              <w:rPr>
+                <w:sz w:val="24"/>
+              </w:rPr>
+            </w:r>
+            <w:r>
+              <w:rPr>
+                <w:sz w:val="24"/>
+              </w:rPr>
+              <w:t>Các thông báo đã gửi.</w:t>
+            </w:r>
+          </w:p>
+        </w:tc>
+      </w:tr>
+      <w:tr>
+        <w:tc>
+          <w:tcPr>
+            <w:tcW w:type="dxa" w:w="1247"/>
+          </w:tcPr>
+          <w:p>
+            <w:pPr>
+              <w:spacing w:line="276" w:lineRule="auto" w:after="40"/>
+            </w:pPr>
+            <w:r>
+              <w:rPr>
+                <w:sz w:val="24"/>
+              </w:rPr>
+            </w:r>
+            <w:r>
+              <w:rPr>
+                <w:sz w:val="24"/>
+              </w:rPr>
+              <w:t>POST</w:t>
+            </w:r>
+          </w:p>
+        </w:tc>
+        <w:tc>
+          <w:tcPr>
+            <w:tcW w:type="dxa" w:w="3175"/>
+          </w:tcPr>
+          <w:p>
+            <w:pPr>
+              <w:spacing w:line="276" w:lineRule="auto" w:after="40"/>
+            </w:pPr>
+            <w:r>
+              <w:rPr>
+                <w:sz w:val="24"/>
+              </w:rPr>
+            </w:r>
+            <w:r>
+              <w:rPr>
+                <w:sz w:val="24"/>
+              </w:rPr>
+              <w:t>/api/staff/exams/{id}/messages</w:t>
+            </w:r>
+          </w:p>
+        </w:tc>
+        <w:tc>
+          <w:tcPr>
+            <w:tcW w:type="dxa" w:w="1814"/>
+          </w:tcPr>
+          <w:p>
+            <w:pPr>
+              <w:spacing w:line="276" w:lineRule="auto" w:after="40"/>
+            </w:pPr>
+            <w:r>
+              <w:rPr>
+                <w:sz w:val="24"/>
+              </w:rPr>
+            </w:r>
+            <w:r>
+              <w:rPr>
+                <w:sz w:val="24"/>
+              </w:rPr>
+              <w:t>Mảng kỳ thi, giám thị</w:t>
+            </w:r>
+          </w:p>
+        </w:tc>
+        <w:tc>
+          <w:tcPr>
+            <w:tcW w:type="dxa" w:w="2835"/>
+          </w:tcPr>
+          <w:p>
+            <w:pPr>
+              <w:spacing w:line="276" w:lineRule="auto" w:after="40"/>
+            </w:pPr>
+            <w:r>
+              <w:rPr>
+                <w:sz w:val="24"/>
+              </w:rPr>
+            </w:r>
+            <w:r>
+              <w:rPr>
+                <w:sz w:val="24"/>
+              </w:rPr>
+              <w:t>Gửi thông báo cho cả phòng hoặc từng thí sinh.</w:t>
+            </w:r>
+          </w:p>
+        </w:tc>
+      </w:tr>
+      <w:tr>
+        <w:tc>
+          <w:tcPr>
+            <w:tcW w:type="dxa" w:w="1247"/>
+          </w:tcPr>
+          <w:p>
+            <w:pPr>
+              <w:spacing w:line="276" w:lineRule="auto" w:after="40"/>
+            </w:pPr>
+            <w:r>
+              <w:rPr>
+                <w:sz w:val="24"/>
+              </w:rPr>
+            </w:r>
+            <w:r>
+              <w:rPr>
+                <w:sz w:val="24"/>
+              </w:rPr>
+              <w:t>GET</w:t>
+            </w:r>
+          </w:p>
+        </w:tc>
+        <w:tc>
+          <w:tcPr>
+            <w:tcW w:type="dxa" w:w="3175"/>
+          </w:tcPr>
+          <w:p>
+            <w:pPr>
+              <w:spacing w:line="276" w:lineRule="auto" w:after="40"/>
+            </w:pPr>
+            <w:r>
+              <w:rPr>
+                <w:sz w:val="24"/>
+              </w:rPr>
+            </w:r>
+            <w:r>
+              <w:rPr>
+                <w:sz w:val="24"/>
+              </w:rPr>
+              <w:t>/api/staff/exams/{id}/sections/{sid}/warnings</w:t>
+            </w:r>
+          </w:p>
+        </w:tc>
+        <w:tc>
+          <w:tcPr>
+            <w:tcW w:type="dxa" w:w="1814"/>
+          </w:tcPr>
+          <w:p>
+            <w:pPr>
+              <w:spacing w:line="276" w:lineRule="auto" w:after="40"/>
+            </w:pPr>
+            <w:r>
+              <w:rPr>
+                <w:sz w:val="24"/>
+              </w:rPr>
+            </w:r>
+            <w:r>
+              <w:rPr>
+                <w:sz w:val="24"/>
+              </w:rPr>
+              <w:t>Mảng kỳ thi, giám thị</w:t>
+            </w:r>
+          </w:p>
+        </w:tc>
+        <w:tc>
+          <w:tcPr>
+            <w:tcW w:type="dxa" w:w="2835"/>
+          </w:tcPr>
+          <w:p>
+            <w:pPr>
+              <w:spacing w:line="276" w:lineRule="auto" w:after="40"/>
+            </w:pPr>
+            <w:r>
+              <w:rPr>
+                <w:sz w:val="24"/>
+              </w:rPr>
+            </w:r>
+            <w:r>
+              <w:rPr>
+                <w:sz w:val="24"/>
+              </w:rPr>
+              <w:t>Cảnh báo của phần thi (chưa xử lý trước).</w:t>
+            </w:r>
+          </w:p>
+        </w:tc>
+      </w:tr>
+      <w:tr>
+        <w:tc>
+          <w:tcPr>
+            <w:tcW w:type="dxa" w:w="1247"/>
+          </w:tcPr>
+          <w:p>
+            <w:pPr>
+              <w:spacing w:line="276" w:lineRule="auto" w:after="40"/>
+            </w:pPr>
+            <w:r>
+              <w:rPr>
+                <w:sz w:val="24"/>
+              </w:rPr>
+            </w:r>
+            <w:r>
+              <w:rPr>
+                <w:sz w:val="24"/>
+              </w:rPr>
+              <w:t>POST</w:t>
+            </w:r>
+          </w:p>
+        </w:tc>
+        <w:tc>
+          <w:tcPr>
+            <w:tcW w:type="dxa" w:w="3175"/>
+          </w:tcPr>
+          <w:p>
+            <w:pPr>
+              <w:spacing w:line="276" w:lineRule="auto" w:after="40"/>
+            </w:pPr>
+            <w:r>
+              <w:rPr>
+                <w:sz w:val="24"/>
+              </w:rPr>
+            </w:r>
+            <w:r>
+              <w:rPr>
+                <w:sz w:val="24"/>
+              </w:rPr>
+              <w:t>/api/staff/exams/{id}/sections/{sid}/warnings/{wid}/resolve</w:t>
+            </w:r>
+          </w:p>
+        </w:tc>
+        <w:tc>
+          <w:tcPr>
+            <w:tcW w:type="dxa" w:w="1814"/>
+          </w:tcPr>
+          <w:p>
+            <w:pPr>
+              <w:spacing w:line="276" w:lineRule="auto" w:after="40"/>
+            </w:pPr>
+            <w:r>
+              <w:rPr>
+                <w:sz w:val="24"/>
+              </w:rPr>
+            </w:r>
+            <w:r>
+              <w:rPr>
+                <w:sz w:val="24"/>
+              </w:rPr>
+              <w:t>Mảng kỳ thi, giám thị</w:t>
+            </w:r>
+          </w:p>
+        </w:tc>
+        <w:tc>
+          <w:tcPr>
+            <w:tcW w:type="dxa" w:w="2835"/>
+          </w:tcPr>
+          <w:p>
+            <w:pPr>
+              <w:spacing w:line="276" w:lineRule="auto" w:after="40"/>
+            </w:pPr>
+            <w:r>
+              <w:rPr>
+                <w:sz w:val="24"/>
+              </w:rPr>
+            </w:r>
+            <w:r>
+              <w:rPr>
+                <w:sz w:val="24"/>
+              </w:rPr>
+              <w:t>Đánh dấu cảnh báo đã xử lý (vẫn giữ trong nhật ký).</w:t>
             </w:r>
           </w:p>
         </w:tc>
@@ -6467,7 +7185,391 @@
           <w:b/>
           <w:sz w:val="24"/>
         </w:rPr>
-        <w:t>Bảng 11. Tài khoản nhân sự và duyệt chéo</w:t>
+        <w:t>Bảng 11. Kết quả và chấm điểm</w:t>
+      </w:r>
+    </w:p>
+    <w:tbl>
+      <w:tblPr>
+        <w:tblStyle w:val="TableGrid"/>
+        <w:tblW w:type="auto" w:w="0"/>
+        <w:jc w:val="center"/>
+        <w:tblLook w:firstColumn="1" w:firstRow="1" w:lastColumn="0" w:lastRow="0" w:noHBand="0" w:noVBand="1" w:val="04A0"/>
+      </w:tblPr>
+      <w:tblGrid>
+        <w:gridCol w:w="2268"/>
+        <w:gridCol w:w="2268"/>
+        <w:gridCol w:w="2268"/>
+        <w:gridCol w:w="2268"/>
+      </w:tblGrid>
+      <w:tr>
+        <w:trPr>
+          <w:tblHeader w:val="true"/>
+        </w:trPr>
+        <w:tc>
+          <w:tcPr>
+            <w:tcW w:type="dxa" w:w="1247"/>
+            <w:shd w:val="clear" w:color="auto" w:fill="D9E2F3"/>
+          </w:tcPr>
+          <w:p>
+            <w:pPr>
+              <w:keepNext/>
+              <w:spacing w:line="276" w:lineRule="auto" w:after="40"/>
+            </w:pPr>
+            <w:r>
+              <w:rPr>
+                <w:sz w:val="24"/>
+              </w:rPr>
+            </w:r>
+            <w:r>
+              <w:rPr>
+                <w:b/>
+                <w:sz w:val="24"/>
+              </w:rPr>
+              <w:t>Phương thức</w:t>
+            </w:r>
+          </w:p>
+        </w:tc>
+        <w:tc>
+          <w:tcPr>
+            <w:tcW w:type="dxa" w:w="3175"/>
+            <w:shd w:val="clear" w:color="auto" w:fill="D9E2F3"/>
+          </w:tcPr>
+          <w:p>
+            <w:pPr>
+              <w:spacing w:line="276" w:lineRule="auto" w:after="40"/>
+            </w:pPr>
+            <w:r>
+              <w:rPr>
+                <w:sz w:val="24"/>
+              </w:rPr>
+            </w:r>
+            <w:r>
+              <w:rPr>
+                <w:b/>
+                <w:sz w:val="24"/>
+              </w:rPr>
+              <w:t>Đường dẫn</w:t>
+            </w:r>
+          </w:p>
+        </w:tc>
+        <w:tc>
+          <w:tcPr>
+            <w:tcW w:type="dxa" w:w="1814"/>
+            <w:shd w:val="clear" w:color="auto" w:fill="D9E2F3"/>
+          </w:tcPr>
+          <w:p>
+            <w:pPr>
+              <w:spacing w:line="276" w:lineRule="auto" w:after="40"/>
+            </w:pPr>
+            <w:r>
+              <w:rPr>
+                <w:sz w:val="24"/>
+              </w:rPr>
+            </w:r>
+            <w:r>
+              <w:rPr>
+                <w:b/>
+                <w:sz w:val="24"/>
+              </w:rPr>
+              <w:t>Quyền</w:t>
+            </w:r>
+          </w:p>
+        </w:tc>
+        <w:tc>
+          <w:tcPr>
+            <w:tcW w:type="dxa" w:w="2835"/>
+            <w:shd w:val="clear" w:color="auto" w:fill="D9E2F3"/>
+          </w:tcPr>
+          <w:p>
+            <w:pPr>
+              <w:spacing w:line="276" w:lineRule="auto" w:after="40"/>
+            </w:pPr>
+            <w:r>
+              <w:rPr>
+                <w:sz w:val="24"/>
+              </w:rPr>
+            </w:r>
+            <w:r>
+              <w:rPr>
+                <w:b/>
+                <w:sz w:val="24"/>
+              </w:rPr>
+              <w:t>Mô tả</w:t>
+            </w:r>
+          </w:p>
+        </w:tc>
+      </w:tr>
+      <w:tr>
+        <w:tc>
+          <w:tcPr>
+            <w:tcW w:type="dxa" w:w="1247"/>
+          </w:tcPr>
+          <w:p>
+            <w:pPr>
+              <w:spacing w:line="276" w:lineRule="auto" w:after="40"/>
+            </w:pPr>
+            <w:r>
+              <w:rPr>
+                <w:sz w:val="24"/>
+              </w:rPr>
+            </w:r>
+            <w:r>
+              <w:rPr>
+                <w:sz w:val="24"/>
+              </w:rPr>
+              <w:t>GET</w:t>
+            </w:r>
+          </w:p>
+        </w:tc>
+        <w:tc>
+          <w:tcPr>
+            <w:tcW w:type="dxa" w:w="3175"/>
+          </w:tcPr>
+          <w:p>
+            <w:pPr>
+              <w:spacing w:line="276" w:lineRule="auto" w:after="40"/>
+            </w:pPr>
+            <w:r>
+              <w:rPr>
+                <w:sz w:val="24"/>
+              </w:rPr>
+            </w:r>
+            <w:r>
+              <w:rPr>
+                <w:sz w:val="24"/>
+              </w:rPr>
+              <w:t>/api/staff/exams/{id}/results</w:t>
+            </w:r>
+          </w:p>
+        </w:tc>
+        <w:tc>
+          <w:tcPr>
+            <w:tcW w:type="dxa" w:w="1814"/>
+          </w:tcPr>
+          <w:p>
+            <w:pPr>
+              <w:spacing w:line="276" w:lineRule="auto" w:after="40"/>
+            </w:pPr>
+            <w:r>
+              <w:rPr>
+                <w:sz w:val="24"/>
+              </w:rPr>
+            </w:r>
+            <w:r>
+              <w:rPr>
+                <w:sz w:val="24"/>
+              </w:rPr>
+              <w:t>Admin, giám khảo</w:t>
+            </w:r>
+          </w:p>
+        </w:tc>
+        <w:tc>
+          <w:tcPr>
+            <w:tcW w:type="dxa" w:w="2835"/>
+          </w:tcPr>
+          <w:p>
+            <w:pPr>
+              <w:spacing w:line="276" w:lineRule="auto" w:after="40"/>
+            </w:pPr>
+            <w:r>
+              <w:rPr>
+                <w:sz w:val="24"/>
+              </w:rPr>
+            </w:r>
+            <w:r>
+              <w:rPr>
+                <w:sz w:val="24"/>
+              </w:rPr>
+              <w:t>Bảng điểm từng thí sinh, từng phần thi.</w:t>
+            </w:r>
+          </w:p>
+        </w:tc>
+      </w:tr>
+      <w:tr>
+        <w:tc>
+          <w:tcPr>
+            <w:tcW w:type="dxa" w:w="1247"/>
+          </w:tcPr>
+          <w:p>
+            <w:pPr>
+              <w:spacing w:line="276" w:lineRule="auto" w:after="40"/>
+            </w:pPr>
+            <w:r>
+              <w:rPr>
+                <w:sz w:val="24"/>
+              </w:rPr>
+            </w:r>
+            <w:r>
+              <w:rPr>
+                <w:sz w:val="24"/>
+              </w:rPr>
+              <w:t>GET</w:t>
+            </w:r>
+          </w:p>
+        </w:tc>
+        <w:tc>
+          <w:tcPr>
+            <w:tcW w:type="dxa" w:w="3175"/>
+          </w:tcPr>
+          <w:p>
+            <w:pPr>
+              <w:spacing w:line="276" w:lineRule="auto" w:after="40"/>
+            </w:pPr>
+            <w:r>
+              <w:rPr>
+                <w:sz w:val="24"/>
+              </w:rPr>
+            </w:r>
+            <w:r>
+              <w:rPr>
+                <w:sz w:val="24"/>
+              </w:rPr>
+              <w:t>/api/staff/attempts/{id}/marking</w:t>
+            </w:r>
+          </w:p>
+        </w:tc>
+        <w:tc>
+          <w:tcPr>
+            <w:tcW w:type="dxa" w:w="1814"/>
+          </w:tcPr>
+          <w:p>
+            <w:pPr>
+              <w:spacing w:line="276" w:lineRule="auto" w:after="40"/>
+            </w:pPr>
+            <w:r>
+              <w:rPr>
+                <w:sz w:val="24"/>
+              </w:rPr>
+            </w:r>
+            <w:r>
+              <w:rPr>
+                <w:sz w:val="24"/>
+              </w:rPr>
+              <w:t>Giám khảo được phân công</w:t>
+            </w:r>
+          </w:p>
+        </w:tc>
+        <w:tc>
+          <w:tcPr>
+            <w:tcW w:type="dxa" w:w="2835"/>
+          </w:tcPr>
+          <w:p>
+            <w:pPr>
+              <w:spacing w:line="276" w:lineRule="auto" w:after="40"/>
+            </w:pPr>
+            <w:r>
+              <w:rPr>
+                <w:sz w:val="24"/>
+              </w:rPr>
+            </w:r>
+            <w:r>
+              <w:rPr>
+                <w:sz w:val="24"/>
+              </w:rPr>
+              <w:t>Bài làm từng câu kèm đáp án; 409 khi phần thi chưa nộp.</w:t>
+            </w:r>
+          </w:p>
+        </w:tc>
+      </w:tr>
+      <w:tr>
+        <w:tc>
+          <w:tcPr>
+            <w:tcW w:type="dxa" w:w="1247"/>
+          </w:tcPr>
+          <w:p>
+            <w:pPr>
+              <w:spacing w:line="276" w:lineRule="auto" w:after="40"/>
+            </w:pPr>
+            <w:r>
+              <w:rPr>
+                <w:sz w:val="24"/>
+              </w:rPr>
+            </w:r>
+            <w:r>
+              <w:rPr>
+                <w:sz w:val="24"/>
+              </w:rPr>
+              <w:t>POST</w:t>
+            </w:r>
+          </w:p>
+        </w:tc>
+        <w:tc>
+          <w:tcPr>
+            <w:tcW w:type="dxa" w:w="3175"/>
+          </w:tcPr>
+          <w:p>
+            <w:pPr>
+              <w:spacing w:line="276" w:lineRule="auto" w:after="40"/>
+            </w:pPr>
+            <w:r>
+              <w:rPr>
+                <w:sz w:val="24"/>
+              </w:rPr>
+            </w:r>
+            <w:r>
+              <w:rPr>
+                <w:sz w:val="24"/>
+              </w:rPr>
+              <w:t>/api/staff/attempts/{id}/writing-marks</w:t>
+            </w:r>
+          </w:p>
+        </w:tc>
+        <w:tc>
+          <w:tcPr>
+            <w:tcW w:type="dxa" w:w="1814"/>
+          </w:tcPr>
+          <w:p>
+            <w:pPr>
+              <w:spacing w:line="276" w:lineRule="auto" w:after="40"/>
+            </w:pPr>
+            <w:r>
+              <w:rPr>
+                <w:sz w:val="24"/>
+              </w:rPr>
+            </w:r>
+            <w:r>
+              <w:rPr>
+                <w:sz w:val="24"/>
+              </w:rPr>
+              <w:t>Giám khảo được phân công</w:t>
+            </w:r>
+          </w:p>
+        </w:tc>
+        <w:tc>
+          <w:tcPr>
+            <w:tcW w:type="dxa" w:w="2835"/>
+          </w:tcPr>
+          <w:p>
+            <w:pPr>
+              <w:spacing w:line="276" w:lineRule="auto" w:after="40"/>
+            </w:pPr>
+            <w:r>
+              <w:rPr>
+                <w:sz w:val="24"/>
+              </w:rPr>
+            </w:r>
+            <w:r>
+              <w:rPr>
+                <w:sz w:val="24"/>
+              </w:rPr>
+              <w:t>Chấm một câu Writing; đủ câu thì điểm Hoàn tất.</w:t>
+            </w:r>
+          </w:p>
+        </w:tc>
+      </w:tr>
+    </w:tbl>
+    <w:p/>
+    <w:p>
+      <w:pPr>
+        <w:keepNext/>
+        <w:jc w:val="center"/>
+      </w:pPr>
+      <w:r>
+        <w:rPr>
+          <w:b/>
+          <w:sz w:val="24"/>
+        </w:rPr>
+        <w:t>Bảng 12. Tài khoản nhân sự và duyệt chéo</w:t>
       </w:r>
     </w:p>
     <w:tbl>
@@ -7203,7 +8305,7 @@
           <w:b/>
           <w:sz w:val="24"/>
         </w:rPr>
-        <w:t>Bảng 12. SignalR và kiểm tra sức khoẻ</w:t>
+        <w:t>Bảng 13. SignalR và kiểm tra sức khoẻ</w:t>
       </w:r>
     </w:p>
     <w:tbl>

</xml_diff>

<commit_message>
docs: blank papers and Announce start in the specs, README, CLAUDE.md and progress log
</commit_message>
<xml_diff>
--- a/thesis/doc/DacTaThietKe_API_HeThongThiVictory_TranHoangLong.docx
+++ b/thesis/doc/DacTaThietKe_API_HeThongThiVictory_TranHoangLong.docx
@@ -3826,7 +3826,7 @@
               <w:rPr>
                 <w:sz w:val="24"/>
               </w:rPr>
-              <w:t>Xuất bản đề để xếp vào kỳ thi.</w:t>
+              <w:t>Xuất bản đề để xếp vào kỳ thi; 400 kèm danh sách nếu còn chữ, hình, file nghe giữ chỗ.</w:t>
             </w:r>
           </w:p>
         </w:tc>
@@ -4343,6 +4343,350 @@
                 <w:sz w:val="24"/>
               </w:rPr>
               <w:t>Thay file nghe của part (mp3, m4a, ogg, wav; tối đa 60 MB).</w:t>
+            </w:r>
+          </w:p>
+        </w:tc>
+      </w:tr>
+      <w:tr>
+        <w:tc>
+          <w:tcPr>
+            <w:tcW w:type="dxa" w:w="1247"/>
+          </w:tcPr>
+          <w:p>
+            <w:pPr>
+              <w:spacing w:line="276" w:lineRule="auto" w:after="40"/>
+            </w:pPr>
+            <w:r>
+              <w:rPr>
+                <w:sz w:val="24"/>
+              </w:rPr>
+            </w:r>
+            <w:r>
+              <w:rPr>
+                <w:sz w:val="24"/>
+              </w:rPr>
+              <w:t>GET</w:t>
+            </w:r>
+          </w:p>
+        </w:tc>
+        <w:tc>
+          <w:tcPr>
+            <w:tcW w:type="dxa" w:w="3175"/>
+          </w:tcPr>
+          <w:p>
+            <w:pPr>
+              <w:spacing w:line="276" w:lineRule="auto" w:after="40"/>
+            </w:pPr>
+            <w:r>
+              <w:rPr>
+                <w:sz w:val="24"/>
+              </w:rPr>
+            </w:r>
+            <w:r>
+              <w:rPr>
+                <w:sz w:val="24"/>
+              </w:rPr>
+              <w:t>/api/admin/papers/blank-layouts</w:t>
+            </w:r>
+          </w:p>
+        </w:tc>
+        <w:tc>
+          <w:tcPr>
+            <w:tcW w:type="dxa" w:w="1814"/>
+          </w:tcPr>
+          <w:p>
+            <w:pPr>
+              <w:spacing w:line="276" w:lineRule="auto" w:after="40"/>
+            </w:pPr>
+            <w:r>
+              <w:rPr>
+                <w:sz w:val="24"/>
+              </w:rPr>
+            </w:r>
+            <w:r>
+              <w:rPr>
+                <w:sz w:val="24"/>
+              </w:rPr>
+              <w:t>Mảng đề thi</w:t>
+            </w:r>
+          </w:p>
+        </w:tc>
+        <w:tc>
+          <w:tcPr>
+            <w:tcW w:type="dxa" w:w="2835"/>
+          </w:tcPr>
+          <w:p>
+            <w:pPr>
+              <w:spacing w:line="276" w:lineRule="auto" w:after="40"/>
+            </w:pPr>
+            <w:r>
+              <w:rPr>
+                <w:sz w:val="24"/>
+              </w:rPr>
+            </w:r>
+            <w:r>
+              <w:rPr>
+                <w:sz w:val="24"/>
+              </w:rPr>
+              <w:t>Các phần thi có khung đề trắng (A2 R&amp;W, A2 Listening).</w:t>
+            </w:r>
+          </w:p>
+        </w:tc>
+      </w:tr>
+      <w:tr>
+        <w:tc>
+          <w:tcPr>
+            <w:tcW w:type="dxa" w:w="1247"/>
+          </w:tcPr>
+          <w:p>
+            <w:pPr>
+              <w:spacing w:line="276" w:lineRule="auto" w:after="40"/>
+            </w:pPr>
+            <w:r>
+              <w:rPr>
+                <w:sz w:val="24"/>
+              </w:rPr>
+            </w:r>
+            <w:r>
+              <w:rPr>
+                <w:sz w:val="24"/>
+              </w:rPr>
+              <w:t>POST</w:t>
+            </w:r>
+          </w:p>
+        </w:tc>
+        <w:tc>
+          <w:tcPr>
+            <w:tcW w:type="dxa" w:w="3175"/>
+          </w:tcPr>
+          <w:p>
+            <w:pPr>
+              <w:spacing w:line="276" w:lineRule="auto" w:after="40"/>
+            </w:pPr>
+            <w:r>
+              <w:rPr>
+                <w:sz w:val="24"/>
+              </w:rPr>
+            </w:r>
+            <w:r>
+              <w:rPr>
+                <w:sz w:val="24"/>
+              </w:rPr>
+              <w:t>/api/admin/papers/blank</w:t>
+            </w:r>
+          </w:p>
+        </w:tc>
+        <w:tc>
+          <w:tcPr>
+            <w:tcW w:type="dxa" w:w="1814"/>
+          </w:tcPr>
+          <w:p>
+            <w:pPr>
+              <w:spacing w:line="276" w:lineRule="auto" w:after="40"/>
+            </w:pPr>
+            <w:r>
+              <w:rPr>
+                <w:sz w:val="24"/>
+              </w:rPr>
+            </w:r>
+            <w:r>
+              <w:rPr>
+                <w:sz w:val="24"/>
+              </w:rPr>
+              <w:t>Mảng đề thi</w:t>
+            </w:r>
+          </w:p>
+        </w:tc>
+        <w:tc>
+          <w:tcPr>
+            <w:tcW w:type="dxa" w:w="2835"/>
+          </w:tcPr>
+          <w:p>
+            <w:pPr>
+              <w:spacing w:line="276" w:lineRule="auto" w:after="40"/>
+            </w:pPr>
+            <w:r>
+              <w:rPr>
+                <w:sz w:val="24"/>
+              </w:rPr>
+            </w:r>
+            <w:r>
+              <w:rPr>
+                <w:sz w:val="24"/>
+              </w:rPr>
+              <w:t>Tạo đề nháp trắng theo khung A2: chữ "[to write…]", hình và file nghe giữ chỗ.</w:t>
+            </w:r>
+          </w:p>
+        </w:tc>
+      </w:tr>
+      <w:tr>
+        <w:tc>
+          <w:tcPr>
+            <w:tcW w:type="dxa" w:w="1247"/>
+          </w:tcPr>
+          <w:p>
+            <w:pPr>
+              <w:spacing w:line="276" w:lineRule="auto" w:after="40"/>
+            </w:pPr>
+            <w:r>
+              <w:rPr>
+                <w:sz w:val="24"/>
+              </w:rPr>
+            </w:r>
+            <w:r>
+              <w:rPr>
+                <w:sz w:val="24"/>
+              </w:rPr>
+              <w:t>POST</w:t>
+            </w:r>
+          </w:p>
+        </w:tc>
+        <w:tc>
+          <w:tcPr>
+            <w:tcW w:type="dxa" w:w="3175"/>
+          </w:tcPr>
+          <w:p>
+            <w:pPr>
+              <w:spacing w:line="276" w:lineRule="auto" w:after="40"/>
+            </w:pPr>
+            <w:r>
+              <w:rPr>
+                <w:sz w:val="24"/>
+              </w:rPr>
+            </w:r>
+            <w:r>
+              <w:rPr>
+                <w:sz w:val="24"/>
+              </w:rPr>
+              <w:t>/api/admin/papers/{id}/images</w:t>
+            </w:r>
+          </w:p>
+        </w:tc>
+        <w:tc>
+          <w:tcPr>
+            <w:tcW w:type="dxa" w:w="1814"/>
+          </w:tcPr>
+          <w:p>
+            <w:pPr>
+              <w:spacing w:line="276" w:lineRule="auto" w:after="40"/>
+            </w:pPr>
+            <w:r>
+              <w:rPr>
+                <w:sz w:val="24"/>
+              </w:rPr>
+            </w:r>
+            <w:r>
+              <w:rPr>
+                <w:sz w:val="24"/>
+              </w:rPr>
+              <w:t>Mảng đề thi</w:t>
+            </w:r>
+          </w:p>
+        </w:tc>
+        <w:tc>
+          <w:tcPr>
+            <w:tcW w:type="dxa" w:w="2835"/>
+          </w:tcPr>
+          <w:p>
+            <w:pPr>
+              <w:spacing w:line="276" w:lineRule="auto" w:after="40"/>
+            </w:pPr>
+            <w:r>
+              <w:rPr>
+                <w:sz w:val="24"/>
+              </w:rPr>
+            </w:r>
+            <w:r>
+              <w:rPr>
+                <w:sz w:val="24"/>
+              </w:rPr>
+              <w:t>Tải hình cho đoạn văn hoặc câu hỏi; trả URL để chèn &lt;img&gt;.</w:t>
+            </w:r>
+          </w:p>
+        </w:tc>
+      </w:tr>
+      <w:tr>
+        <w:tc>
+          <w:tcPr>
+            <w:tcW w:type="dxa" w:w="1247"/>
+          </w:tcPr>
+          <w:p>
+            <w:pPr>
+              <w:spacing w:line="276" w:lineRule="auto" w:after="40"/>
+            </w:pPr>
+            <w:r>
+              <w:rPr>
+                <w:sz w:val="24"/>
+              </w:rPr>
+            </w:r>
+            <w:r>
+              <w:rPr>
+                <w:sz w:val="24"/>
+              </w:rPr>
+              <w:t>POST</w:t>
+            </w:r>
+          </w:p>
+        </w:tc>
+        <w:tc>
+          <w:tcPr>
+            <w:tcW w:type="dxa" w:w="3175"/>
+          </w:tcPr>
+          <w:p>
+            <w:pPr>
+              <w:spacing w:line="276" w:lineRule="auto" w:after="40"/>
+            </w:pPr>
+            <w:r>
+              <w:rPr>
+                <w:sz w:val="24"/>
+              </w:rPr>
+            </w:r>
+            <w:r>
+              <w:rPr>
+                <w:sz w:val="24"/>
+              </w:rPr>
+              <w:t>/api/admin/papers/{id}/questions/{number}/options/{key}/image</w:t>
+            </w:r>
+          </w:p>
+        </w:tc>
+        <w:tc>
+          <w:tcPr>
+            <w:tcW w:type="dxa" w:w="1814"/>
+          </w:tcPr>
+          <w:p>
+            <w:pPr>
+              <w:spacing w:line="276" w:lineRule="auto" w:after="40"/>
+            </w:pPr>
+            <w:r>
+              <w:rPr>
+                <w:sz w:val="24"/>
+              </w:rPr>
+            </w:r>
+            <w:r>
+              <w:rPr>
+                <w:sz w:val="24"/>
+              </w:rPr>
+              <w:t>Mảng đề thi</w:t>
+            </w:r>
+          </w:p>
+        </w:tc>
+        <w:tc>
+          <w:tcPr>
+            <w:tcW w:type="dxa" w:w="2835"/>
+          </w:tcPr>
+          <w:p>
+            <w:pPr>
+              <w:spacing w:line="276" w:lineRule="auto" w:after="40"/>
+            </w:pPr>
+            <w:r>
+              <w:rPr>
+                <w:sz w:val="24"/>
+              </w:rPr>
+            </w:r>
+            <w:r>
+              <w:rPr>
+                <w:sz w:val="24"/>
+              </w:rPr>
+              <w:t>Thay hình của một lựa chọn (câu chọn tranh).</w:t>
             </w:r>
           </w:p>
         </w:tc>
@@ -6997,6 +7341,92 @@
                 <w:sz w:val="24"/>
               </w:rPr>
               <w:t>Gửi thông báo cho cả phòng hoặc từng thí sinh.</w:t>
+            </w:r>
+          </w:p>
+        </w:tc>
+      </w:tr>
+      <w:tr>
+        <w:tc>
+          <w:tcPr>
+            <w:tcW w:type="dxa" w:w="1247"/>
+          </w:tcPr>
+          <w:p>
+            <w:pPr>
+              <w:spacing w:line="276" w:lineRule="auto" w:after="40"/>
+            </w:pPr>
+            <w:r>
+              <w:rPr>
+                <w:sz w:val="24"/>
+              </w:rPr>
+            </w:r>
+            <w:r>
+              <w:rPr>
+                <w:sz w:val="24"/>
+              </w:rPr>
+              <w:t>POST</w:t>
+            </w:r>
+          </w:p>
+        </w:tc>
+        <w:tc>
+          <w:tcPr>
+            <w:tcW w:type="dxa" w:w="3175"/>
+          </w:tcPr>
+          <w:p>
+            <w:pPr>
+              <w:spacing w:line="276" w:lineRule="auto" w:after="40"/>
+            </w:pPr>
+            <w:r>
+              <w:rPr>
+                <w:sz w:val="24"/>
+              </w:rPr>
+            </w:r>
+            <w:r>
+              <w:rPr>
+                <w:sz w:val="24"/>
+              </w:rPr>
+              <w:t>/api/staff/exams/{id}/sections/{sid}/announce-start</w:t>
+            </w:r>
+          </w:p>
+        </w:tc>
+        <w:tc>
+          <w:tcPr>
+            <w:tcW w:type="dxa" w:w="1814"/>
+          </w:tcPr>
+          <w:p>
+            <w:pPr>
+              <w:spacing w:line="276" w:lineRule="auto" w:after="40"/>
+            </w:pPr>
+            <w:r>
+              <w:rPr>
+                <w:sz w:val="24"/>
+              </w:rPr>
+            </w:r>
+            <w:r>
+              <w:rPr>
+                <w:sz w:val="24"/>
+              </w:rPr>
+              <w:t>Mảng kỳ thi, giám thị</w:t>
+            </w:r>
+          </w:p>
+        </w:tc>
+        <w:tc>
+          <w:tcPr>
+            <w:tcW w:type="dxa" w:w="2835"/>
+          </w:tcPr>
+          <w:p>
+            <w:pPr>
+              <w:spacing w:line="276" w:lineRule="auto" w:after="40"/>
+            </w:pPr>
+            <w:r>
+              <w:rPr>
+                <w:sz w:val="24"/>
+              </w:rPr>
+            </w:r>
+            <w:r>
+              <w:rPr>
+                <w:sz w:val="24"/>
+              </w:rPr>
+              <w:t>Báo phòng bắt đầu; thí sinh đã làm trước đó nhận cảnh báo StartedEarly.</w:t>
             </w:r>
           </w:p>
         </w:tc>

</xml_diff>